<commit_message>
feat(eval): mitigasi penuh revisi Bu Henning (3DC balanced allocation, batch 100-10k run, evaluasi NASA iPSC & sintetis, grafik komparatif)
</commit_message>
<xml_diff>
--- a/Tugas_3_Kelompok_8_Final_3DC.docx
+++ b/Tugas_3_Kelompok_8_Final_3DC.docx
@@ -2397,53 +2397,42 @@
     </w:p>
     <w:tbl>
       <w:tblPr>
-        <w:tblW w:type="auto" w:w="0"/>
-        <w:jc w:val="left"/>
-        <w:tblInd w:type="dxa" w:w="10"/>
+        <w:tblW w:w="9500" w:type="dxa"/>
+        <w:jc w:val="center"/>
         <w:tblBorders>
-          <w:top w:color="BEBEBE" w:space="0" w:sz="8" w:val="single"/>
-          <w:left w:color="BEBEBE" w:space="0" w:sz="8" w:val="single"/>
-          <w:bottom w:color="BEBEBE" w:space="0" w:sz="8" w:val="single"/>
-          <w:right w:color="BEBEBE" w:space="0" w:sz="8" w:val="single"/>
-          <w:insideH w:color="BEBEBE" w:space="0" w:sz="8" w:val="single"/>
-          <w:insideV w:color="BEBEBE" w:space="0" w:sz="8" w:val="single"/>
+          <w:top w:val="single" w:sz="4" w:space="0" w:color="CBD5E1"/>
+          <w:left w:val="none"/>
+          <w:bottom w:val="single" w:sz="4" w:space="0" w:color="CBD5E1"/>
+          <w:right w:val="none"/>
+          <w:insideH w:val="single" w:sz="4" w:space="0" w:color="F1F5F9"/>
+          <w:insideV w:val="none"/>
         </w:tblBorders>
-        <w:tblLayout w:type="fixed"/>
-        <w:tblCellMar>
-          <w:top w:type="dxa" w:w="0"/>
-          <w:left w:type="dxa" w:w="0"/>
-          <w:bottom w:type="dxa" w:w="0"/>
-          <w:right w:type="dxa" w:w="0"/>
-        </w:tblCellMar>
-        <w:tblLook w:val="01E0"/>
       </w:tblPr>
-      <w:tblGrid>
-        <w:gridCol w:w="2500"/>
-        <w:gridCol w:w="4800"/>
-        <w:gridCol w:w="2060"/>
-      </w:tblGrid>
       <w:tr>
         <w:trPr>
-          <w:trHeight w:hRule="atLeast" w:val="539"/>
+          <w:tblHeader/>
         </w:trPr>
         <w:tc>
           <w:tcPr>
-            <w:tcW w:type="dxa" w:w="2500"/>
-            <w:shd w:color="auto" w:fill="F1F1F1" w:val="clear"/>
+            <w:tcW w:w="2200" w:type="dxa"/>
+            <w:shd w:val="clear" w:color="auto" w:fill="F1F5F9"/>
+            <w:tcMar>
+              <w:top w:w="100" w:type="dxa"/>
+              <w:bottom w:w="100" w:type="dxa"/>
+              <w:left w:w="120" w:type="dxa"/>
+              <w:right w:w="120" w:type="dxa"/>
+            </w:tcMar>
           </w:tcPr>
           <w:p>
             <w:pPr>
-              <w:pStyle w:val="TableParagraph"/>
-              <w:spacing w:before="82"/>
-              <w:rPr>
-                <w:rFonts w:ascii="Poppins"/>
-                <w:sz w:val="24"/>
-              </w:rPr>
+              <w:jc w:val="center"/>
             </w:pPr>
             <w:r>
               <w:rPr>
-                <w:rFonts w:ascii="Poppins"/>
-                <w:sz w:val="24"/>
+                <w:b/>
+                <w:rFonts w:ascii="Segoe UI" w:hAnsi="Segoe UI"/>
+                <w:sz w:val="17"/>
+                <w:color w:val="1E293B"/>
               </w:rPr>
               <w:t>Komponen</w:t>
             </w:r>
@@ -2451,71 +2440,75 @@
         </w:tc>
         <w:tc>
           <w:tcPr>
-            <w:tcW w:type="dxa" w:w="4800"/>
-            <w:shd w:color="auto" w:fill="F1F1F1" w:val="clear"/>
+            <w:tcW w:w="5200" w:type="dxa"/>
+            <w:shd w:val="clear" w:color="auto" w:fill="F1F5F9"/>
+            <w:tcMar>
+              <w:top w:w="100" w:type="dxa"/>
+              <w:bottom w:w="100" w:type="dxa"/>
+              <w:left w:w="120" w:type="dxa"/>
+              <w:right w:w="120" w:type="dxa"/>
+            </w:tcMar>
           </w:tcPr>
           <w:p>
             <w:pPr>
-              <w:pStyle w:val="TableParagraph"/>
-              <w:spacing w:before="82"/>
-              <w:ind w:left="12" w:right="3"/>
-              <w:rPr>
-                <w:rFonts w:ascii="Poppins"/>
-                <w:sz w:val="24"/>
-              </w:rPr>
+              <w:jc w:val="center"/>
             </w:pPr>
             <w:r>
               <w:rPr>
-                <w:rFonts w:ascii="Poppins"/>
-                <w:sz w:val="24"/>
-              </w:rPr>
-              <w:t>Spesifikasi</w:t>
-            </w:r>
-          </w:p>
-        </w:tc>
-        <w:tc>
-          <w:tcPr>
-            <w:tcW w:type="dxa" w:w="2060"/>
-            <w:shd w:color="auto" w:fill="F1F1F1" w:val="clear"/>
+                <w:b/>
+                <w:rFonts w:ascii="Segoe UI" w:hAnsi="Segoe UI"/>
+                <w:sz w:val="17"/>
+                <w:color w:val="1E293B"/>
+              </w:rPr>
+              <w:t>Spesifikasi Detail Arsitektur</w:t>
+            </w:r>
+          </w:p>
+        </w:tc>
+        <w:tc>
+          <w:tcPr>
+            <w:tcW w:w="2100" w:type="dxa"/>
+            <w:shd w:val="clear" w:color="auto" w:fill="F1F5F9"/>
+            <w:tcMar>
+              <w:top w:w="100" w:type="dxa"/>
+              <w:bottom w:w="100" w:type="dxa"/>
+              <w:left w:w="120" w:type="dxa"/>
+              <w:right w:w="120" w:type="dxa"/>
+            </w:tcMar>
           </w:tcPr>
           <w:p>
             <w:pPr>
-              <w:pStyle w:val="TableParagraph"/>
-              <w:spacing w:before="82"/>
-              <w:rPr>
-                <w:rFonts w:ascii="Poppins"/>
-                <w:sz w:val="24"/>
-              </w:rPr>
+              <w:jc w:val="center"/>
             </w:pPr>
             <w:r>
               <w:rPr>
-                <w:rFonts w:ascii="Poppins"/>
-                <w:sz w:val="24"/>
-              </w:rPr>
-              <w:t>Jumlah</w:t>
+                <w:b/>
+                <w:rFonts w:ascii="Segoe UI" w:hAnsi="Segoe UI"/>
+                <w:sz w:val="17"/>
+                <w:color w:val="1E293B"/>
+              </w:rPr>
+              <w:t>Kuantitas</w:t>
             </w:r>
           </w:p>
         </w:tc>
       </w:tr>
       <w:tr>
-        <w:trPr>
-          <w:trHeight w:hRule="atLeast" w:val="979"/>
-        </w:trPr>
-        <w:tc>
-          <w:tcPr>
-            <w:tcW w:type="dxa" w:w="2500"/>
-          </w:tcPr>
-          <w:p>
-            <w:pPr>
-              <w:pStyle w:val="TableParagraph"/>
-              <w:spacing w:before="102"/>
-              <w:rPr>
-                <w:sz w:val="24"/>
-              </w:rPr>
-            </w:pPr>
-            <w:r>
-              <w:rPr>
-                <w:sz w:val="24"/>
+        <w:tc>
+          <w:tcPr>
+            <w:tcW w:w="2200" w:type="dxa"/>
+            <w:tcMar>
+              <w:top w:w="100" w:type="dxa"/>
+              <w:bottom w:w="100" w:type="dxa"/>
+              <w:left w:w="120" w:type="dxa"/>
+              <w:right w:w="120" w:type="dxa"/>
+            </w:tcMar>
+          </w:tcPr>
+          <w:p>
+            <w:pPr/>
+            <w:r>
+              <w:rPr>
+                <w:rFonts w:ascii="Segoe UI" w:hAnsi="Segoe UI"/>
+                <w:sz w:val="17"/>
+                <w:color w:val="334155"/>
               </w:rPr>
               <w:t>Datacenter</w:t>
             </w:r>
@@ -2523,261 +2516,249 @@
         </w:tc>
         <w:tc>
           <w:tcPr>
-            <w:tcW w:type="dxa" w:w="4800"/>
-          </w:tcPr>
-          <w:p>
-            <w:pPr>
-              <w:pStyle w:val="TableParagraph"/>
-              <w:spacing w:before="102" w:line="276" w:lineRule="auto"/>
-              <w:ind w:hanging="805" w:left="1196"/>
-              <w:jc w:val="left"/>
-              <w:rPr>
-                <w:sz w:val="24"/>
-              </w:rPr>
-            </w:pPr>
-            <w:r>
-              <w:rPr>
-                <w:sz w:val="24"/>
-              </w:rPr>
-              <w:t xml:space="preserve">3 datacenter heterogen sebagai lingkungan simulasi</w:t>
-            </w:r>
-          </w:p>
-        </w:tc>
-        <w:tc>
-          <w:tcPr>
-            <w:tcW w:type="dxa" w:w="2060"/>
-          </w:tcPr>
-          <w:p>
-            <w:pPr>
-              <w:pStyle w:val="TableParagraph"/>
-              <w:spacing w:before="102"/>
-              <w:rPr>
-                <w:sz w:val="24"/>
-              </w:rPr>
-            </w:pPr>
-            <w:r>
-              <w:rPr>
-                <w:sz w:val="24"/>
-              </w:rPr>
-              <w:t>3</w:t>
+            <w:tcW w:w="5200" w:type="dxa"/>
+            <w:tcMar>
+              <w:top w:w="100" w:type="dxa"/>
+              <w:bottom w:w="100" w:type="dxa"/>
+              <w:left w:w="120" w:type="dxa"/>
+              <w:right w:w="120" w:type="dxa"/>
+            </w:tcMar>
+          </w:tcPr>
+          <w:p>
+            <w:pPr/>
+            <w:r>
+              <w:rPr>
+                <w:rFonts w:ascii="Segoe UI" w:hAnsi="Segoe UI"/>
+                <w:sz w:val="17"/>
+                <w:color w:val="334155"/>
+              </w:rPr>
+              <w:t>3 Datacenter Heterogen Multi-Region (DC-1 Jakarta Entry-Level/Low-Grade, DC-2 Surabaya Standard/Mid-Grade, DC-3 Bandung Premium/High-Grade)</w:t>
+            </w:r>
+          </w:p>
+        </w:tc>
+        <w:tc>
+          <w:tcPr>
+            <w:tcW w:w="2100" w:type="dxa"/>
+            <w:tcMar>
+              <w:top w:w="100" w:type="dxa"/>
+              <w:bottom w:w="100" w:type="dxa"/>
+              <w:left w:w="120" w:type="dxa"/>
+              <w:right w:w="120" w:type="dxa"/>
+            </w:tcMar>
+          </w:tcPr>
+          <w:p>
+            <w:pPr/>
+            <w:r>
+              <w:rPr>
+                <w:rFonts w:ascii="Segoe UI" w:hAnsi="Segoe UI"/>
+                <w:sz w:val="17"/>
+                <w:color w:val="334155"/>
+              </w:rPr>
+              <w:t>3 Datacenter</w:t>
             </w:r>
           </w:p>
         </w:tc>
       </w:tr>
       <w:tr>
-        <w:trPr>
-          <w:trHeight w:hRule="atLeast" w:val="979"/>
-        </w:trPr>
-        <w:tc>
-          <w:tcPr>
-            <w:tcW w:type="dxa" w:w="2500"/>
-          </w:tcPr>
-          <w:p>
-            <w:pPr>
-              <w:pStyle w:val="TableParagraph"/>
-              <w:spacing w:before="94"/>
-              <w:rPr>
-                <w:sz w:val="24"/>
-              </w:rPr>
-            </w:pPr>
-            <w:r>
-              <w:rPr>
-                <w:sz w:val="24"/>
-              </w:rPr>
-              <w:t>Host</w:t>
-            </w:r>
-          </w:p>
-        </w:tc>
-        <w:tc>
-          <w:tcPr>
-            <w:tcW w:type="dxa" w:w="4800"/>
-          </w:tcPr>
-          <w:p>
-            <w:pPr>
-              <w:pStyle w:val="TableParagraph"/>
-              <w:spacing w:before="94" w:line="276" w:lineRule="auto"/>
-              <w:ind w:hanging="1282" w:left="1474" w:right="180"/>
-              <w:jc w:val="left"/>
-              <w:rPr>
-                <w:sz w:val="24"/>
-              </w:rPr>
-            </w:pPr>
-            <w:r>
-              <w:rPr>
-                <w:sz w:val="24"/>
-              </w:rPr>
-              <w:t xml:space="preserve">Heterogen dengan variasi MIPS, RAM, dan bandwidth</w:t>
-            </w:r>
-          </w:p>
-        </w:tc>
-        <w:tc>
-          <w:tcPr>
-            <w:tcW w:type="dxa" w:w="2060"/>
-          </w:tcPr>
-          <w:p>
-            <w:pPr>
-              <w:pStyle w:val="TableParagraph"/>
-              <w:spacing w:before="94"/>
-              <w:rPr>
-                <w:sz w:val="24"/>
-              </w:rPr>
-            </w:pPr>
-            <w:r>
-              <w:rPr>
-                <w:sz w:val="24"/>
-              </w:rPr>
-              <w:t>8</w:t>
+        <w:tc>
+          <w:tcPr>
+            <w:tcW w:w="2200" w:type="dxa"/>
+            <w:tcMar>
+              <w:top w:w="100" w:type="dxa"/>
+              <w:bottom w:w="100" w:type="dxa"/>
+              <w:left w:w="120" w:type="dxa"/>
+              <w:right w:w="120" w:type="dxa"/>
+            </w:tcMar>
+          </w:tcPr>
+          <w:p>
+            <w:pPr/>
+            <w:r>
+              <w:rPr>
+                <w:rFonts w:ascii="Segoe UI" w:hAnsi="Segoe UI"/>
+                <w:sz w:val="17"/>
+                <w:color w:val="334155"/>
+              </w:rPr>
+              <w:t>Host Fisik</w:t>
+            </w:r>
+          </w:p>
+        </w:tc>
+        <w:tc>
+          <w:tcPr>
+            <w:tcW w:w="5200" w:type="dxa"/>
+            <w:tcMar>
+              <w:top w:w="100" w:type="dxa"/>
+              <w:bottom w:w="100" w:type="dxa"/>
+              <w:left w:w="120" w:type="dxa"/>
+              <w:right w:w="120" w:type="dxa"/>
+            </w:tcMar>
+          </w:tcPr>
+          <w:p>
+            <w:pPr/>
+            <w:r>
+              <w:rPr>
+                <w:rFonts w:ascii="Segoe UI" w:hAnsi="Segoe UI"/>
+                <w:sz w:val="17"/>
+                <w:color w:val="334155"/>
+              </w:rPr>
+              <w:t>24 Host Fisik Heterogen (8 Host per DC, 8 PE/Host, 4 Tipe A-D, total 480 GB RAM, model daya SPECpower)</w:t>
+            </w:r>
+          </w:p>
+        </w:tc>
+        <w:tc>
+          <w:tcPr>
+            <w:tcW w:w="2100" w:type="dxa"/>
+            <w:tcMar>
+              <w:top w:w="100" w:type="dxa"/>
+              <w:bottom w:w="100" w:type="dxa"/>
+              <w:left w:w="120" w:type="dxa"/>
+              <w:right w:w="120" w:type="dxa"/>
+            </w:tcMar>
+          </w:tcPr>
+          <w:p>
+            <w:pPr/>
+            <w:r>
+              <w:rPr>
+                <w:rFonts w:ascii="Segoe UI" w:hAnsi="Segoe UI"/>
+                <w:sz w:val="17"/>
+                <w:color w:val="334155"/>
+              </w:rPr>
+              <w:t>24 Unit (192 Core, 352.000 MIPS)</w:t>
             </w:r>
           </w:p>
         </w:tc>
       </w:tr>
       <w:tr>
-        <w:trPr>
-          <w:trHeight w:hRule="atLeast" w:val="960"/>
-        </w:trPr>
-        <w:tc>
-          <w:tcPr>
-            <w:tcW w:type="dxa" w:w="2500"/>
-          </w:tcPr>
-          <w:p>
-            <w:pPr>
-              <w:pStyle w:val="TableParagraph"/>
-              <w:spacing w:before="87"/>
-              <w:rPr>
-                <w:sz w:val="24"/>
-              </w:rPr>
-            </w:pPr>
-            <w:r>
-              <w:rPr>
-                <w:sz w:val="24"/>
-              </w:rPr>
-              <w:t>VM</w:t>
-            </w:r>
-          </w:p>
-        </w:tc>
-        <w:tc>
-          <w:tcPr>
-            <w:tcW w:type="dxa" w:w="4800"/>
-          </w:tcPr>
-          <w:p>
-            <w:pPr>
-              <w:pStyle w:val="TableParagraph"/>
-              <w:spacing w:before="87" w:line="276" w:lineRule="auto"/>
-              <w:ind w:hanging="1548" w:left="1866"/>
-              <w:jc w:val="left"/>
-              <w:rPr>
-                <w:sz w:val="24"/>
-              </w:rPr>
-            </w:pPr>
-            <w:r>
-              <w:rPr>
-                <w:sz w:val="24"/>
-              </w:rPr>
-              <w:t xml:space="preserve">Heterogen dengan variasi MIPS, PE, dan RAM</w:t>
-            </w:r>
-          </w:p>
-        </w:tc>
-        <w:tc>
-          <w:tcPr>
-            <w:tcW w:type="dxa" w:w="2060"/>
-          </w:tcPr>
-          <w:p>
-            <w:pPr>
-              <w:pStyle w:val="TableParagraph"/>
-              <w:spacing w:before="87"/>
-              <w:rPr>
-                <w:sz w:val="24"/>
-              </w:rPr>
-            </w:pPr>
-            <w:r>
-              <w:rPr>
-                <w:sz w:val="24"/>
-              </w:rPr>
-              <w:t xml:space="preserve">30 VM</w:t>
+        <w:tc>
+          <w:tcPr>
+            <w:tcW w:w="2200" w:type="dxa"/>
+            <w:tcMar>
+              <w:top w:w="100" w:type="dxa"/>
+              <w:bottom w:w="100" w:type="dxa"/>
+              <w:left w:w="120" w:type="dxa"/>
+              <w:right w:w="120" w:type="dxa"/>
+            </w:tcMar>
+          </w:tcPr>
+          <w:p>
+            <w:pPr/>
+            <w:r>
+              <w:rPr>
+                <w:rFonts w:ascii="Segoe UI" w:hAnsi="Segoe UI"/>
+                <w:sz w:val="17"/>
+                <w:color w:val="334155"/>
+              </w:rPr>
+              <w:t>Virtual Machine (VM)</w:t>
+            </w:r>
+          </w:p>
+        </w:tc>
+        <w:tc>
+          <w:tcPr>
+            <w:tcW w:w="5200" w:type="dxa"/>
+            <w:tcMar>
+              <w:top w:w="100" w:type="dxa"/>
+              <w:bottom w:w="100" w:type="dxa"/>
+              <w:left w:w="120" w:type="dxa"/>
+              <w:right w:w="120" w:type="dxa"/>
+            </w:tcMar>
+          </w:tcPr>
+          <w:p>
+            <w:pPr/>
+            <w:r>
+              <w:rPr>
+                <w:rFonts w:ascii="Segoe UI" w:hAnsi="Segoe UI"/>
+                <w:sz w:val="17"/>
+                <w:color w:val="334155"/>
+              </w:rPr>
+              <w:t>30 VM Heterogen (10 Small di DC-1, 10 Medium di DC-2, 10 Large di DC-3) dengan alokasi penyerataan berimbang</w:t>
+            </w:r>
+          </w:p>
+        </w:tc>
+        <w:tc>
+          <w:tcPr>
+            <w:tcW w:w="2100" w:type="dxa"/>
+            <w:tcMar>
+              <w:top w:w="100" w:type="dxa"/>
+              <w:bottom w:w="100" w:type="dxa"/>
+              <w:left w:w="120" w:type="dxa"/>
+              <w:right w:w="120" w:type="dxa"/>
+            </w:tcMar>
+          </w:tcPr>
+          <w:p>
+            <w:pPr/>
+            <w:r>
+              <w:rPr>
+                <w:rFonts w:ascii="Segoe UI" w:hAnsi="Segoe UI"/>
+                <w:sz w:val="17"/>
+                <w:color w:val="334155"/>
+              </w:rPr>
+              <w:t>30 VM (Total 70 Core, 70 GB RAM)</w:t>
             </w:r>
           </w:p>
         </w:tc>
       </w:tr>
       <w:tr>
-        <w:trPr>
-          <w:trHeight w:hRule="atLeast" w:val="1400"/>
-        </w:trPr>
-        <w:tc>
-          <w:tcPr>
-            <w:tcW w:type="dxa" w:w="2500"/>
-          </w:tcPr>
-          <w:p>
-            <w:pPr>
-              <w:pStyle w:val="TableParagraph"/>
-              <w:spacing w:before="101"/>
-              <w:rPr>
-                <w:sz w:val="24"/>
-              </w:rPr>
-            </w:pPr>
-            <w:r>
-              <w:rPr>
-                <w:sz w:val="24"/>
-              </w:rPr>
-              <w:t>Task/Cloudlet</w:t>
-            </w:r>
-          </w:p>
-        </w:tc>
-        <w:tc>
-          <w:tcPr>
-            <w:tcW w:type="dxa" w:w="4800"/>
-          </w:tcPr>
-          <w:p>
-            <w:pPr>
-              <w:pStyle w:val="TableParagraph"/>
-              <w:spacing w:before="101"/>
-              <w:ind w:left="12" w:right="2"/>
-              <w:rPr>
-                <w:sz w:val="24"/>
-              </w:rPr>
-            </w:pPr>
-            <w:r>
-              <w:rPr>
-                <w:sz w:val="24"/>
-              </w:rPr>
-              <w:t xml:space="preserve">Panjang task bervariasi (MI),</w:t>
-            </w:r>
-          </w:p>
-          <w:p>
-            <w:pPr>
-              <w:pStyle w:val="TableParagraph"/>
-              <w:spacing w:before="45" w:line="276" w:lineRule="auto"/>
-              <w:ind w:left="12"/>
-              <w:rPr>
-                <w:sz w:val="24"/>
-              </w:rPr>
-            </w:pPr>
-            <w:r>
-              <w:rPr>
-                <w:sz w:val="24"/>
-              </w:rPr>
-              <w:t xml:space="preserve">non-preemptive, satu task dieksekusi pada satu VM</w:t>
-            </w:r>
-          </w:p>
-        </w:tc>
-        <w:tc>
-          <w:tcPr>
-            <w:tcW w:type="dxa" w:w="2060"/>
-          </w:tcPr>
-          <w:p>
-            <w:pPr>
-              <w:pStyle w:val="TableParagraph"/>
-              <w:spacing w:before="101" w:line="276" w:lineRule="auto"/>
-              <w:ind w:hanging="296" w:left="514"/>
-              <w:jc w:val="left"/>
-              <w:rPr>
-                <w:sz w:val="24"/>
-              </w:rPr>
-            </w:pPr>
-            <w:r>
-              <w:rPr>
-                <w:sz w:val="24"/>
-              </w:rPr>
-              <w:t xml:space="preserve">1.000 task per skenario</w:t>
+        <w:tc>
+          <w:tcPr>
+            <w:tcW w:w="2200" w:type="dxa"/>
+            <w:tcMar>
+              <w:top w:w="100" w:type="dxa"/>
+              <w:bottom w:w="100" w:type="dxa"/>
+              <w:left w:w="120" w:type="dxa"/>
+              <w:right w:w="120" w:type="dxa"/>
+            </w:tcMar>
+          </w:tcPr>
+          <w:p>
+            <w:pPr/>
+            <w:r>
+              <w:rPr>
+                <w:rFonts w:ascii="Segoe UI" w:hAnsi="Segoe UI"/>
+                <w:sz w:val="17"/>
+                <w:color w:val="334155"/>
+              </w:rPr>
+              <w:t>Task / Cloudlet</w:t>
+            </w:r>
+          </w:p>
+        </w:tc>
+        <w:tc>
+          <w:tcPr>
+            <w:tcW w:w="5200" w:type="dxa"/>
+            <w:tcMar>
+              <w:top w:w="100" w:type="dxa"/>
+              <w:bottom w:w="100" w:type="dxa"/>
+              <w:left w:w="120" w:type="dxa"/>
+              <w:right w:w="120" w:type="dxa"/>
+            </w:tcMar>
+          </w:tcPr>
+          <w:p>
+            <w:pPr/>
+            <w:r>
+              <w:rPr>
+                <w:rFonts w:ascii="Segoe UI" w:hAnsi="Segoe UI"/>
+                <w:sz w:val="17"/>
+                <w:color w:val="334155"/>
+              </w:rPr>
+              <w:t>Bag-of-Tasks independen non-preemptive. Skala bertahap 100-1.000 task (kelipatan 100) dan skala besar 1.000-10.000 task (kelipatan 1.000)</w:t>
+            </w:r>
+          </w:p>
+        </w:tc>
+        <w:tc>
+          <w:tcPr>
+            <w:tcW w:w="2100" w:type="dxa"/>
+            <w:tcMar>
+              <w:top w:w="100" w:type="dxa"/>
+              <w:bottom w:w="100" w:type="dxa"/>
+              <w:left w:w="120" w:type="dxa"/>
+              <w:right w:w="120" w:type="dxa"/>
+            </w:tcMar>
+          </w:tcPr>
+          <w:p>
+            <w:pPr/>
+            <w:r>
+              <w:rPr>
+                <w:rFonts w:ascii="Segoe UI" w:hAnsi="Segoe UI"/>
+                <w:sz w:val="17"/>
+                <w:color w:val="334155"/>
+              </w:rPr>
+              <w:t>100 s.d. 10.000 Task</w:t>
             </w:r>
           </w:p>
         </w:tc>
@@ -2834,190 +2815,2236 @@
     </w:p>
     <w:tbl>
       <w:tblPr>
-        <w:tblW w:type="auto" w:w="0"/>
-        <w:jc w:val="left"/>
-        <w:tblInd w:type="dxa" w:w="10"/>
+        <w:tblW w:w="9500" w:type="dxa"/>
+        <w:jc w:val="center"/>
         <w:tblBorders>
-          <w:top w:color="BEBEBE" w:space="0" w:sz="8" w:val="single"/>
-          <w:left w:color="BEBEBE" w:space="0" w:sz="8" w:val="single"/>
-          <w:bottom w:color="BEBEBE" w:space="0" w:sz="8" w:val="single"/>
-          <w:right w:color="BEBEBE" w:space="0" w:sz="8" w:val="single"/>
-          <w:insideH w:color="BEBEBE" w:space="0" w:sz="8" w:val="single"/>
-          <w:insideV w:color="BEBEBE" w:space="0" w:sz="8" w:val="single"/>
+          <w:top w:val="single" w:sz="4" w:space="0" w:color="CBD5E1"/>
+          <w:left w:val="none"/>
+          <w:bottom w:val="single" w:sz="4" w:space="0" w:color="CBD5E1"/>
+          <w:right w:val="none"/>
+          <w:insideH w:val="single" w:sz="4" w:space="0" w:color="F1F5F9"/>
+          <w:insideV w:val="none"/>
         </w:tblBorders>
-        <w:tblLayout w:type="fixed"/>
-        <w:tblCellMar>
-          <w:top w:type="dxa" w:w="0"/>
-          <w:left w:type="dxa" w:w="0"/>
-          <w:bottom w:type="dxa" w:w="0"/>
-          <w:right w:type="dxa" w:w="0"/>
-        </w:tblCellMar>
-        <w:tblLook w:val="01E0"/>
       </w:tblPr>
-      <w:tblGrid>
-        <w:gridCol w:w="1540"/>
-        <w:gridCol w:w="1880"/>
-        <w:gridCol w:w="1820"/>
-        <w:gridCol w:w="1900"/>
-        <w:gridCol w:w="2220"/>
-      </w:tblGrid>
       <w:tr>
         <w:trPr>
-          <w:trHeight w:hRule="atLeast" w:val="560"/>
+          <w:tblHeader/>
         </w:trPr>
         <w:tc>
           <w:tcPr>
-            <w:tcW w:type="dxa" w:w="1540"/>
-            <w:shd w:color="auto" w:fill="F1F1F1" w:val="clear"/>
+            <w:tcW w:w="1800" w:type="dxa"/>
+            <w:shd w:val="clear" w:color="auto" w:fill="F1F5F9"/>
+            <w:tcMar>
+              <w:top w:w="100" w:type="dxa"/>
+              <w:bottom w:w="100" w:type="dxa"/>
+              <w:left w:w="120" w:type="dxa"/>
+              <w:right w:w="120" w:type="dxa"/>
+            </w:tcMar>
           </w:tcPr>
           <w:p>
             <w:pPr>
-              <w:pStyle w:val="TableParagraph"/>
-              <w:rPr>
-                <w:rFonts w:ascii="Poppins"/>
-                <w:sz w:val="24"/>
-              </w:rPr>
+              <w:jc w:val="center"/>
             </w:pPr>
             <w:r>
               <w:rPr>
-                <w:rFonts w:ascii="Poppins"/>
-                <w:sz w:val="24"/>
-              </w:rPr>
-              <w:t xml:space="preserve">Tipe Host</w:t>
-            </w:r>
-          </w:p>
-        </w:tc>
-        <w:tc>
-          <w:tcPr>
-            <w:tcW w:type="dxa" w:w="1880"/>
-            <w:shd w:color="auto" w:fill="F1F1F1" w:val="clear"/>
+                <w:b/>
+                <w:rFonts w:ascii="Segoe UI" w:hAnsi="Segoe UI"/>
+                <w:sz w:val="17"/>
+                <w:color w:val="1E293B"/>
+              </w:rPr>
+              <w:t>Datacenter</w:t>
+            </w:r>
+          </w:p>
+        </w:tc>
+        <w:tc>
+          <w:tcPr>
+            <w:tcW w:w="900" w:type="dxa"/>
+            <w:shd w:val="clear" w:color="auto" w:fill="F1F5F9"/>
+            <w:tcMar>
+              <w:top w:w="100" w:type="dxa"/>
+              <w:bottom w:w="100" w:type="dxa"/>
+              <w:left w:w="120" w:type="dxa"/>
+              <w:right w:w="120" w:type="dxa"/>
+            </w:tcMar>
           </w:tcPr>
           <w:p>
             <w:pPr>
-              <w:pStyle w:val="TableParagraph"/>
-              <w:ind w:left="19"/>
-              <w:rPr>
-                <w:rFonts w:ascii="Poppins"/>
-                <w:sz w:val="24"/>
-              </w:rPr>
+              <w:jc w:val="center"/>
             </w:pPr>
             <w:r>
               <w:rPr>
-                <w:rFonts w:ascii="Poppins"/>
-                <w:sz w:val="24"/>
-              </w:rPr>
-              <w:t>MIPS/core</w:t>
-            </w:r>
-          </w:p>
-        </w:tc>
-        <w:tc>
-          <w:tcPr>
-            <w:tcW w:type="dxa" w:w="1820"/>
-            <w:shd w:color="auto" w:fill="F1F1F1" w:val="clear"/>
+                <w:b/>
+                <w:rFonts w:ascii="Segoe UI" w:hAnsi="Segoe UI"/>
+                <w:sz w:val="17"/>
+                <w:color w:val="1E293B"/>
+              </w:rPr>
+              <w:t>Tipe Host</w:t>
+            </w:r>
+          </w:p>
+        </w:tc>
+        <w:tc>
+          <w:tcPr>
+            <w:tcW w:w="500" w:type="dxa"/>
+            <w:shd w:val="clear" w:color="auto" w:fill="F1F5F9"/>
+            <w:tcMar>
+              <w:top w:w="100" w:type="dxa"/>
+              <w:bottom w:w="100" w:type="dxa"/>
+              <w:left w:w="120" w:type="dxa"/>
+              <w:right w:w="120" w:type="dxa"/>
+            </w:tcMar>
           </w:tcPr>
           <w:p>
             <w:pPr>
-              <w:pStyle w:val="TableParagraph"/>
-              <w:ind w:left="24"/>
-              <w:rPr>
-                <w:rFonts w:ascii="Poppins"/>
-                <w:sz w:val="24"/>
-              </w:rPr>
+              <w:jc w:val="center"/>
             </w:pPr>
             <w:r>
               <w:rPr>
-                <w:rFonts w:ascii="Poppins"/>
-                <w:sz w:val="24"/>
-              </w:rPr>
-              <w:t xml:space="preserve">RAM (GB)</w:t>
-            </w:r>
-          </w:p>
-        </w:tc>
-        <w:tc>
-          <w:tcPr>
-            <w:tcW w:type="dxa" w:w="1900"/>
-            <w:shd w:color="auto" w:fill="F1F1F1" w:val="clear"/>
+                <w:b/>
+                <w:rFonts w:ascii="Segoe UI" w:hAnsi="Segoe UI"/>
+                <w:sz w:val="17"/>
+                <w:color w:val="1E293B"/>
+              </w:rPr>
+              <w:t>PE</w:t>
+            </w:r>
+          </w:p>
+        </w:tc>
+        <w:tc>
+          <w:tcPr>
+            <w:tcW w:w="900" w:type="dxa"/>
+            <w:shd w:val="clear" w:color="auto" w:fill="F1F5F9"/>
+            <w:tcMar>
+              <w:top w:w="100" w:type="dxa"/>
+              <w:bottom w:w="100" w:type="dxa"/>
+              <w:left w:w="120" w:type="dxa"/>
+              <w:right w:w="120" w:type="dxa"/>
+            </w:tcMar>
           </w:tcPr>
           <w:p>
             <w:pPr>
-              <w:pStyle w:val="TableParagraph"/>
-              <w:ind w:left="9"/>
-              <w:rPr>
-                <w:rFonts w:ascii="Poppins"/>
-                <w:sz w:val="24"/>
-              </w:rPr>
+              <w:jc w:val="center"/>
             </w:pPr>
             <w:r>
               <w:rPr>
-                <w:rFonts w:ascii="Poppins"/>
-                <w:sz w:val="24"/>
-              </w:rPr>
-              <w:t>Bandwidth</w:t>
-            </w:r>
-          </w:p>
-        </w:tc>
-        <w:tc>
-          <w:tcPr>
-            <w:tcW w:type="dxa" w:w="2220"/>
-            <w:shd w:color="auto" w:fill="F1F1F1" w:val="clear"/>
+                <w:b/>
+                <w:rFonts w:ascii="Segoe UI" w:hAnsi="Segoe UI"/>
+                <w:sz w:val="17"/>
+                <w:color w:val="1E293B"/>
+              </w:rPr>
+              <w:t>MIPS/PE</w:t>
+            </w:r>
+          </w:p>
+        </w:tc>
+        <w:tc>
+          <w:tcPr>
+            <w:tcW w:w="800" w:type="dxa"/>
+            <w:shd w:val="clear" w:color="auto" w:fill="F1F5F9"/>
+            <w:tcMar>
+              <w:top w:w="100" w:type="dxa"/>
+              <w:bottom w:w="100" w:type="dxa"/>
+              <w:left w:w="120" w:type="dxa"/>
+              <w:right w:w="120" w:type="dxa"/>
+            </w:tcMar>
           </w:tcPr>
           <w:p>
             <w:pPr>
-              <w:pStyle w:val="TableParagraph"/>
-              <w:ind w:left="14"/>
-              <w:rPr>
-                <w:rFonts w:ascii="Poppins"/>
-                <w:sz w:val="24"/>
-              </w:rPr>
+              <w:jc w:val="center"/>
             </w:pPr>
             <w:r>
               <w:rPr>
-                <w:rFonts w:ascii="Poppins"/>
-                <w:sz w:val="24"/>
-              </w:rPr>
-              <w:t xml:space="preserve">Jumlah Unit</w:t>
+                <w:b/>
+                <w:rFonts w:ascii="Segoe UI" w:hAnsi="Segoe UI"/>
+                <w:sz w:val="17"/>
+                <w:color w:val="1E293B"/>
+              </w:rPr>
+              <w:t>RAM</w:t>
+            </w:r>
+          </w:p>
+        </w:tc>
+        <w:tc>
+          <w:tcPr>
+            <w:tcW w:w="700" w:type="dxa"/>
+            <w:shd w:val="clear" w:color="auto" w:fill="F1F5F9"/>
+            <w:tcMar>
+              <w:top w:w="100" w:type="dxa"/>
+              <w:bottom w:w="100" w:type="dxa"/>
+              <w:left w:w="120" w:type="dxa"/>
+              <w:right w:w="120" w:type="dxa"/>
+            </w:tcMar>
+          </w:tcPr>
+          <w:p>
+            <w:pPr>
+              <w:jc w:val="center"/>
+            </w:pPr>
+            <w:r>
+              <w:rPr>
+                <w:b/>
+                <w:rFonts w:ascii="Segoe UI" w:hAnsi="Segoe UI"/>
+                <w:sz w:val="17"/>
+                <w:color w:val="1E293B"/>
+              </w:rPr>
+              <w:t>BW</w:t>
+            </w:r>
+          </w:p>
+        </w:tc>
+        <w:tc>
+          <w:tcPr>
+            <w:tcW w:w="800" w:type="dxa"/>
+            <w:shd w:val="clear" w:color="auto" w:fill="F1F5F9"/>
+            <w:tcMar>
+              <w:top w:w="100" w:type="dxa"/>
+              <w:bottom w:w="100" w:type="dxa"/>
+              <w:left w:w="120" w:type="dxa"/>
+              <w:right w:w="120" w:type="dxa"/>
+            </w:tcMar>
+          </w:tcPr>
+          <w:p>
+            <w:pPr>
+              <w:jc w:val="center"/>
+            </w:pPr>
+            <w:r>
+              <w:rPr>
+                <w:b/>
+                <w:rFonts w:ascii="Segoe UI" w:hAnsi="Segoe UI"/>
+                <w:sz w:val="17"/>
+                <w:color w:val="1E293B"/>
+              </w:rPr>
+              <w:t>Idle (W)</w:t>
+            </w:r>
+          </w:p>
+        </w:tc>
+        <w:tc>
+          <w:tcPr>
+            <w:tcW w:w="800" w:type="dxa"/>
+            <w:shd w:val="clear" w:color="auto" w:fill="F1F5F9"/>
+            <w:tcMar>
+              <w:top w:w="100" w:type="dxa"/>
+              <w:bottom w:w="100" w:type="dxa"/>
+              <w:left w:w="120" w:type="dxa"/>
+              <w:right w:w="120" w:type="dxa"/>
+            </w:tcMar>
+          </w:tcPr>
+          <w:p>
+            <w:pPr>
+              <w:jc w:val="center"/>
+            </w:pPr>
+            <w:r>
+              <w:rPr>
+                <w:b/>
+                <w:rFonts w:ascii="Segoe UI" w:hAnsi="Segoe UI"/>
+                <w:sz w:val="17"/>
+                <w:color w:val="1E293B"/>
+              </w:rPr>
+              <w:t>Max (W)</w:t>
+            </w:r>
+          </w:p>
+        </w:tc>
+        <w:tc>
+          <w:tcPr>
+            <w:tcW w:w="600" w:type="dxa"/>
+            <w:shd w:val="clear" w:color="auto" w:fill="F1F5F9"/>
+            <w:tcMar>
+              <w:top w:w="100" w:type="dxa"/>
+              <w:bottom w:w="100" w:type="dxa"/>
+              <w:left w:w="120" w:type="dxa"/>
+              <w:right w:w="120" w:type="dxa"/>
+            </w:tcMar>
+          </w:tcPr>
+          <w:p>
+            <w:pPr>
+              <w:jc w:val="center"/>
+            </w:pPr>
+            <w:r>
+              <w:rPr>
+                <w:b/>
+                <w:rFonts w:ascii="Segoe UI" w:hAnsi="Segoe UI"/>
+                <w:sz w:val="17"/>
+                <w:color w:val="1E293B"/>
+              </w:rPr>
+              <w:t>Unit</w:t>
+            </w:r>
+          </w:p>
+        </w:tc>
+        <w:tc>
+          <w:tcPr>
+            <w:tcW w:w="1700" w:type="dxa"/>
+            <w:shd w:val="clear" w:color="auto" w:fill="F1F5F9"/>
+            <w:tcMar>
+              <w:top w:w="100" w:type="dxa"/>
+              <w:bottom w:w="100" w:type="dxa"/>
+              <w:left w:w="120" w:type="dxa"/>
+              <w:right w:w="120" w:type="dxa"/>
+            </w:tcMar>
+          </w:tcPr>
+          <w:p>
+            <w:pPr>
+              <w:jc w:val="center"/>
+            </w:pPr>
+            <w:r>
+              <w:rPr>
+                <w:b/>
+                <w:rFonts w:ascii="Segoe UI" w:hAnsi="Segoe UI"/>
+                <w:sz w:val="17"/>
+                <w:color w:val="1E293B"/>
+              </w:rPr>
+              <w:t>Total MIPS</w:t>
+            </w:r>
+          </w:p>
+        </w:tc>
+      </w:tr>
+      <w:tr>
+        <w:tc>
+          <w:tcPr>
+            <w:tcW w:w="1800" w:type="dxa"/>
+            <w:tcMar>
+              <w:top w:w="100" w:type="dxa"/>
+              <w:bottom w:w="100" w:type="dxa"/>
+              <w:left w:w="120" w:type="dxa"/>
+              <w:right w:w="120" w:type="dxa"/>
+            </w:tcMar>
+          </w:tcPr>
+          <w:p>
+            <w:pPr/>
+            <w:r>
+              <w:rPr>
+                <w:rFonts w:ascii="Segoe UI" w:hAnsi="Segoe UI"/>
+                <w:sz w:val="17"/>
+                <w:color w:val="334155"/>
+              </w:rPr>
+              <w:t>DC-1: Jakarta (Low)</w:t>
+            </w:r>
+          </w:p>
+        </w:tc>
+        <w:tc>
+          <w:tcPr>
+            <w:tcW w:w="900" w:type="dxa"/>
+            <w:tcMar>
+              <w:top w:w="100" w:type="dxa"/>
+              <w:bottom w:w="100" w:type="dxa"/>
+              <w:left w:w="120" w:type="dxa"/>
+              <w:right w:w="120" w:type="dxa"/>
+            </w:tcMar>
+          </w:tcPr>
+          <w:p>
+            <w:pPr/>
+            <w:r>
+              <w:rPr>
+                <w:rFonts w:ascii="Segoe UI" w:hAnsi="Segoe UI"/>
+                <w:sz w:val="17"/>
+                <w:color w:val="334155"/>
+              </w:rPr>
+              <w:t>Tipe A</w:t>
+            </w:r>
+          </w:p>
+        </w:tc>
+        <w:tc>
+          <w:tcPr>
+            <w:tcW w:w="500" w:type="dxa"/>
+            <w:tcMar>
+              <w:top w:w="100" w:type="dxa"/>
+              <w:bottom w:w="100" w:type="dxa"/>
+              <w:left w:w="120" w:type="dxa"/>
+              <w:right w:w="120" w:type="dxa"/>
+            </w:tcMar>
+          </w:tcPr>
+          <w:p>
+            <w:pPr/>
+            <w:r>
+              <w:rPr>
+                <w:rFonts w:ascii="Segoe UI" w:hAnsi="Segoe UI"/>
+                <w:sz w:val="17"/>
+                <w:color w:val="334155"/>
+              </w:rPr>
+              <w:t>8</w:t>
+            </w:r>
+          </w:p>
+        </w:tc>
+        <w:tc>
+          <w:tcPr>
+            <w:tcW w:w="900" w:type="dxa"/>
+            <w:tcMar>
+              <w:top w:w="100" w:type="dxa"/>
+              <w:bottom w:w="100" w:type="dxa"/>
+              <w:left w:w="120" w:type="dxa"/>
+              <w:right w:w="120" w:type="dxa"/>
+            </w:tcMar>
+          </w:tcPr>
+          <w:p>
+            <w:pPr/>
+            <w:r>
+              <w:rPr>
+                <w:rFonts w:ascii="Segoe UI" w:hAnsi="Segoe UI"/>
+                <w:sz w:val="17"/>
+                <w:color w:val="334155"/>
+              </w:rPr>
+              <w:t>1.000</w:t>
+            </w:r>
+          </w:p>
+        </w:tc>
+        <w:tc>
+          <w:tcPr>
+            <w:tcW w:w="800" w:type="dxa"/>
+            <w:tcMar>
+              <w:top w:w="100" w:type="dxa"/>
+              <w:bottom w:w="100" w:type="dxa"/>
+              <w:left w:w="120" w:type="dxa"/>
+              <w:right w:w="120" w:type="dxa"/>
+            </w:tcMar>
+          </w:tcPr>
+          <w:p>
+            <w:pPr/>
+            <w:r>
+              <w:rPr>
+                <w:rFonts w:ascii="Segoe UI" w:hAnsi="Segoe UI"/>
+                <w:sz w:val="17"/>
+                <w:color w:val="334155"/>
+              </w:rPr>
+              <w:t>8 GB</w:t>
+            </w:r>
+          </w:p>
+        </w:tc>
+        <w:tc>
+          <w:tcPr>
+            <w:tcW w:w="700" w:type="dxa"/>
+            <w:tcMar>
+              <w:top w:w="100" w:type="dxa"/>
+              <w:bottom w:w="100" w:type="dxa"/>
+              <w:left w:w="120" w:type="dxa"/>
+              <w:right w:w="120" w:type="dxa"/>
+            </w:tcMar>
+          </w:tcPr>
+          <w:p>
+            <w:pPr/>
+            <w:r>
+              <w:rPr>
+                <w:rFonts w:ascii="Segoe UI" w:hAnsi="Segoe UI"/>
+                <w:sz w:val="17"/>
+                <w:color w:val="334155"/>
+              </w:rPr>
+              <w:t>10 Gbps</w:t>
+            </w:r>
+          </w:p>
+        </w:tc>
+        <w:tc>
+          <w:tcPr>
+            <w:tcW w:w="800" w:type="dxa"/>
+            <w:tcMar>
+              <w:top w:w="100" w:type="dxa"/>
+              <w:bottom w:w="100" w:type="dxa"/>
+              <w:left w:w="120" w:type="dxa"/>
+              <w:right w:w="120" w:type="dxa"/>
+            </w:tcMar>
+          </w:tcPr>
+          <w:p>
+            <w:pPr/>
+            <w:r>
+              <w:rPr>
+                <w:rFonts w:ascii="Segoe UI" w:hAnsi="Segoe UI"/>
+                <w:sz w:val="17"/>
+                <w:color w:val="334155"/>
+              </w:rPr>
+              <w:t>93,7 W</w:t>
+            </w:r>
+          </w:p>
+        </w:tc>
+        <w:tc>
+          <w:tcPr>
+            <w:tcW w:w="800" w:type="dxa"/>
+            <w:tcMar>
+              <w:top w:w="100" w:type="dxa"/>
+              <w:bottom w:w="100" w:type="dxa"/>
+              <w:left w:w="120" w:type="dxa"/>
+              <w:right w:w="120" w:type="dxa"/>
+            </w:tcMar>
+          </w:tcPr>
+          <w:p>
+            <w:pPr/>
+            <w:r>
+              <w:rPr>
+                <w:rFonts w:ascii="Segoe UI" w:hAnsi="Segoe UI"/>
+                <w:sz w:val="17"/>
+                <w:color w:val="334155"/>
+              </w:rPr>
+              <w:t>135,0 W</w:t>
+            </w:r>
+          </w:p>
+        </w:tc>
+        <w:tc>
+          <w:tcPr>
+            <w:tcW w:w="600" w:type="dxa"/>
+            <w:tcMar>
+              <w:top w:w="100" w:type="dxa"/>
+              <w:bottom w:w="100" w:type="dxa"/>
+              <w:left w:w="120" w:type="dxa"/>
+              <w:right w:w="120" w:type="dxa"/>
+            </w:tcMar>
+          </w:tcPr>
+          <w:p>
+            <w:pPr/>
+            <w:r>
+              <w:rPr>
+                <w:rFonts w:ascii="Segoe UI" w:hAnsi="Segoe UI"/>
+                <w:sz w:val="17"/>
+                <w:color w:val="334155"/>
+              </w:rPr>
+              <w:t>4</w:t>
+            </w:r>
+          </w:p>
+        </w:tc>
+        <w:tc>
+          <w:tcPr>
+            <w:tcW w:w="1700" w:type="dxa"/>
+            <w:tcMar>
+              <w:top w:w="100" w:type="dxa"/>
+              <w:bottom w:w="100" w:type="dxa"/>
+              <w:left w:w="120" w:type="dxa"/>
+              <w:right w:w="120" w:type="dxa"/>
+            </w:tcMar>
+          </w:tcPr>
+          <w:p>
+            <w:pPr/>
+            <w:r>
+              <w:rPr>
+                <w:rFonts w:ascii="Segoe UI" w:hAnsi="Segoe UI"/>
+                <w:sz w:val="17"/>
+                <w:color w:val="334155"/>
+              </w:rPr>
+              <w:t>32.000 MIPS</w:t>
+            </w:r>
+          </w:p>
+        </w:tc>
+      </w:tr>
+      <w:tr>
+        <w:tc>
+          <w:tcPr>
+            <w:tcW w:w="1800" w:type="dxa"/>
+            <w:tcMar>
+              <w:top w:w="100" w:type="dxa"/>
+              <w:bottom w:w="100" w:type="dxa"/>
+              <w:left w:w="120" w:type="dxa"/>
+              <w:right w:w="120" w:type="dxa"/>
+            </w:tcMar>
+          </w:tcPr>
+          <w:p>
+            <w:pPr/>
+            <w:r>
+              <w:rPr>
+                <w:rFonts w:ascii="Segoe UI" w:hAnsi="Segoe UI"/>
+                <w:sz w:val="17"/>
+                <w:color w:val="334155"/>
+              </w:rPr>
+              <w:t>DC-1: Jakarta (Low)</w:t>
+            </w:r>
+          </w:p>
+        </w:tc>
+        <w:tc>
+          <w:tcPr>
+            <w:tcW w:w="900" w:type="dxa"/>
+            <w:tcMar>
+              <w:top w:w="100" w:type="dxa"/>
+              <w:bottom w:w="100" w:type="dxa"/>
+              <w:left w:w="120" w:type="dxa"/>
+              <w:right w:w="120" w:type="dxa"/>
+            </w:tcMar>
+          </w:tcPr>
+          <w:p>
+            <w:pPr/>
+            <w:r>
+              <w:rPr>
+                <w:rFonts w:ascii="Segoe UI" w:hAnsi="Segoe UI"/>
+                <w:sz w:val="17"/>
+                <w:color w:val="334155"/>
+              </w:rPr>
+              <w:t>Tipe B</w:t>
+            </w:r>
+          </w:p>
+        </w:tc>
+        <w:tc>
+          <w:tcPr>
+            <w:tcW w:w="500" w:type="dxa"/>
+            <w:tcMar>
+              <w:top w:w="100" w:type="dxa"/>
+              <w:bottom w:w="100" w:type="dxa"/>
+              <w:left w:w="120" w:type="dxa"/>
+              <w:right w:w="120" w:type="dxa"/>
+            </w:tcMar>
+          </w:tcPr>
+          <w:p>
+            <w:pPr/>
+            <w:r>
+              <w:rPr>
+                <w:rFonts w:ascii="Segoe UI" w:hAnsi="Segoe UI"/>
+                <w:sz w:val="17"/>
+                <w:color w:val="334155"/>
+              </w:rPr>
+              <w:t>8</w:t>
+            </w:r>
+          </w:p>
+        </w:tc>
+        <w:tc>
+          <w:tcPr>
+            <w:tcW w:w="900" w:type="dxa"/>
+            <w:tcMar>
+              <w:top w:w="100" w:type="dxa"/>
+              <w:bottom w:w="100" w:type="dxa"/>
+              <w:left w:w="120" w:type="dxa"/>
+              <w:right w:w="120" w:type="dxa"/>
+            </w:tcMar>
+          </w:tcPr>
+          <w:p>
+            <w:pPr/>
+            <w:r>
+              <w:rPr>
+                <w:rFonts w:ascii="Segoe UI" w:hAnsi="Segoe UI"/>
+                <w:sz w:val="17"/>
+                <w:color w:val="334155"/>
+              </w:rPr>
+              <w:t>1.500</w:t>
+            </w:r>
+          </w:p>
+        </w:tc>
+        <w:tc>
+          <w:tcPr>
+            <w:tcW w:w="800" w:type="dxa"/>
+            <w:tcMar>
+              <w:top w:w="100" w:type="dxa"/>
+              <w:bottom w:w="100" w:type="dxa"/>
+              <w:left w:w="120" w:type="dxa"/>
+              <w:right w:w="120" w:type="dxa"/>
+            </w:tcMar>
+          </w:tcPr>
+          <w:p>
+            <w:pPr/>
+            <w:r>
+              <w:rPr>
+                <w:rFonts w:ascii="Segoe UI" w:hAnsi="Segoe UI"/>
+                <w:sz w:val="17"/>
+                <w:color w:val="334155"/>
+              </w:rPr>
+              <w:t>16 GB</w:t>
+            </w:r>
+          </w:p>
+        </w:tc>
+        <w:tc>
+          <w:tcPr>
+            <w:tcW w:w="700" w:type="dxa"/>
+            <w:tcMar>
+              <w:top w:w="100" w:type="dxa"/>
+              <w:bottom w:w="100" w:type="dxa"/>
+              <w:left w:w="120" w:type="dxa"/>
+              <w:right w:w="120" w:type="dxa"/>
+            </w:tcMar>
+          </w:tcPr>
+          <w:p>
+            <w:pPr/>
+            <w:r>
+              <w:rPr>
+                <w:rFonts w:ascii="Segoe UI" w:hAnsi="Segoe UI"/>
+                <w:sz w:val="17"/>
+                <w:color w:val="334155"/>
+              </w:rPr>
+              <w:t>10 Gbps</w:t>
+            </w:r>
+          </w:p>
+        </w:tc>
+        <w:tc>
+          <w:tcPr>
+            <w:tcW w:w="800" w:type="dxa"/>
+            <w:tcMar>
+              <w:top w:w="100" w:type="dxa"/>
+              <w:bottom w:w="100" w:type="dxa"/>
+              <w:left w:w="120" w:type="dxa"/>
+              <w:right w:w="120" w:type="dxa"/>
+            </w:tcMar>
+          </w:tcPr>
+          <w:p>
+            <w:pPr/>
+            <w:r>
+              <w:rPr>
+                <w:rFonts w:ascii="Segoe UI" w:hAnsi="Segoe UI"/>
+                <w:sz w:val="17"/>
+                <w:color w:val="334155"/>
+              </w:rPr>
+              <w:t>105,0 W</w:t>
+            </w:r>
+          </w:p>
+        </w:tc>
+        <w:tc>
+          <w:tcPr>
+            <w:tcW w:w="800" w:type="dxa"/>
+            <w:tcMar>
+              <w:top w:w="100" w:type="dxa"/>
+              <w:bottom w:w="100" w:type="dxa"/>
+              <w:left w:w="120" w:type="dxa"/>
+              <w:right w:w="120" w:type="dxa"/>
+            </w:tcMar>
+          </w:tcPr>
+          <w:p>
+            <w:pPr/>
+            <w:r>
+              <w:rPr>
+                <w:rFonts w:ascii="Segoe UI" w:hAnsi="Segoe UI"/>
+                <w:sz w:val="17"/>
+                <w:color w:val="334155"/>
+              </w:rPr>
+              <w:t>175,0 W</w:t>
+            </w:r>
+          </w:p>
+        </w:tc>
+        <w:tc>
+          <w:tcPr>
+            <w:tcW w:w="600" w:type="dxa"/>
+            <w:tcMar>
+              <w:top w:w="100" w:type="dxa"/>
+              <w:bottom w:w="100" w:type="dxa"/>
+              <w:left w:w="120" w:type="dxa"/>
+              <w:right w:w="120" w:type="dxa"/>
+            </w:tcMar>
+          </w:tcPr>
+          <w:p>
+            <w:pPr/>
+            <w:r>
+              <w:rPr>
+                <w:rFonts w:ascii="Segoe UI" w:hAnsi="Segoe UI"/>
+                <w:sz w:val="17"/>
+                <w:color w:val="334155"/>
+              </w:rPr>
+              <w:t>4</w:t>
+            </w:r>
+          </w:p>
+        </w:tc>
+        <w:tc>
+          <w:tcPr>
+            <w:tcW w:w="1700" w:type="dxa"/>
+            <w:tcMar>
+              <w:top w:w="100" w:type="dxa"/>
+              <w:bottom w:w="100" w:type="dxa"/>
+              <w:left w:w="120" w:type="dxa"/>
+              <w:right w:w="120" w:type="dxa"/>
+            </w:tcMar>
+          </w:tcPr>
+          <w:p>
+            <w:pPr/>
+            <w:r>
+              <w:rPr>
+                <w:rFonts w:ascii="Segoe UI" w:hAnsi="Segoe UI"/>
+                <w:sz w:val="17"/>
+                <w:color w:val="334155"/>
+              </w:rPr>
+              <w:t>48.000 MIPS</w:t>
+            </w:r>
+          </w:p>
+        </w:tc>
+      </w:tr>
+      <w:tr>
+        <w:tc>
+          <w:tcPr>
+            <w:tcW w:w="1800" w:type="dxa"/>
+            <w:tcMar>
+              <w:top w:w="100" w:type="dxa"/>
+              <w:bottom w:w="100" w:type="dxa"/>
+              <w:left w:w="120" w:type="dxa"/>
+              <w:right w:w="120" w:type="dxa"/>
+            </w:tcMar>
+          </w:tcPr>
+          <w:p>
+            <w:pPr/>
+            <w:r>
+              <w:rPr>
+                <w:rFonts w:ascii="Segoe UI" w:hAnsi="Segoe UI"/>
+                <w:sz w:val="17"/>
+                <w:color w:val="334155"/>
+              </w:rPr>
+              <w:t>DC-2: Surabaya (Mid)</w:t>
+            </w:r>
+          </w:p>
+        </w:tc>
+        <w:tc>
+          <w:tcPr>
+            <w:tcW w:w="900" w:type="dxa"/>
+            <w:tcMar>
+              <w:top w:w="100" w:type="dxa"/>
+              <w:bottom w:w="100" w:type="dxa"/>
+              <w:left w:w="120" w:type="dxa"/>
+              <w:right w:w="120" w:type="dxa"/>
+            </w:tcMar>
+          </w:tcPr>
+          <w:p>
+            <w:pPr/>
+            <w:r>
+              <w:rPr>
+                <w:rFonts w:ascii="Segoe UI" w:hAnsi="Segoe UI"/>
+                <w:sz w:val="17"/>
+                <w:color w:val="334155"/>
+              </w:rPr>
+              <w:t>Tipe B</w:t>
+            </w:r>
+          </w:p>
+        </w:tc>
+        <w:tc>
+          <w:tcPr>
+            <w:tcW w:w="500" w:type="dxa"/>
+            <w:tcMar>
+              <w:top w:w="100" w:type="dxa"/>
+              <w:bottom w:w="100" w:type="dxa"/>
+              <w:left w:w="120" w:type="dxa"/>
+              <w:right w:w="120" w:type="dxa"/>
+            </w:tcMar>
+          </w:tcPr>
+          <w:p>
+            <w:pPr/>
+            <w:r>
+              <w:rPr>
+                <w:rFonts w:ascii="Segoe UI" w:hAnsi="Segoe UI"/>
+                <w:sz w:val="17"/>
+                <w:color w:val="334155"/>
+              </w:rPr>
+              <w:t>8</w:t>
+            </w:r>
+          </w:p>
+        </w:tc>
+        <w:tc>
+          <w:tcPr>
+            <w:tcW w:w="900" w:type="dxa"/>
+            <w:tcMar>
+              <w:top w:w="100" w:type="dxa"/>
+              <w:bottom w:w="100" w:type="dxa"/>
+              <w:left w:w="120" w:type="dxa"/>
+              <w:right w:w="120" w:type="dxa"/>
+            </w:tcMar>
+          </w:tcPr>
+          <w:p>
+            <w:pPr/>
+            <w:r>
+              <w:rPr>
+                <w:rFonts w:ascii="Segoe UI" w:hAnsi="Segoe UI"/>
+                <w:sz w:val="17"/>
+                <w:color w:val="334155"/>
+              </w:rPr>
+              <w:t>1.500</w:t>
+            </w:r>
+          </w:p>
+        </w:tc>
+        <w:tc>
+          <w:tcPr>
+            <w:tcW w:w="800" w:type="dxa"/>
+            <w:tcMar>
+              <w:top w:w="100" w:type="dxa"/>
+              <w:bottom w:w="100" w:type="dxa"/>
+              <w:left w:w="120" w:type="dxa"/>
+              <w:right w:w="120" w:type="dxa"/>
+            </w:tcMar>
+          </w:tcPr>
+          <w:p>
+            <w:pPr/>
+            <w:r>
+              <w:rPr>
+                <w:rFonts w:ascii="Segoe UI" w:hAnsi="Segoe UI"/>
+                <w:sz w:val="17"/>
+                <w:color w:val="334155"/>
+              </w:rPr>
+              <w:t>16 GB</w:t>
+            </w:r>
+          </w:p>
+        </w:tc>
+        <w:tc>
+          <w:tcPr>
+            <w:tcW w:w="700" w:type="dxa"/>
+            <w:tcMar>
+              <w:top w:w="100" w:type="dxa"/>
+              <w:bottom w:w="100" w:type="dxa"/>
+              <w:left w:w="120" w:type="dxa"/>
+              <w:right w:w="120" w:type="dxa"/>
+            </w:tcMar>
+          </w:tcPr>
+          <w:p>
+            <w:pPr/>
+            <w:r>
+              <w:rPr>
+                <w:rFonts w:ascii="Segoe UI" w:hAnsi="Segoe UI"/>
+                <w:sz w:val="17"/>
+                <w:color w:val="334155"/>
+              </w:rPr>
+              <w:t>10 Gbps</w:t>
+            </w:r>
+          </w:p>
+        </w:tc>
+        <w:tc>
+          <w:tcPr>
+            <w:tcW w:w="800" w:type="dxa"/>
+            <w:tcMar>
+              <w:top w:w="100" w:type="dxa"/>
+              <w:bottom w:w="100" w:type="dxa"/>
+              <w:left w:w="120" w:type="dxa"/>
+              <w:right w:w="120" w:type="dxa"/>
+            </w:tcMar>
+          </w:tcPr>
+          <w:p>
+            <w:pPr/>
+            <w:r>
+              <w:rPr>
+                <w:rFonts w:ascii="Segoe UI" w:hAnsi="Segoe UI"/>
+                <w:sz w:val="17"/>
+                <w:color w:val="334155"/>
+              </w:rPr>
+              <w:t>105,0 W</w:t>
+            </w:r>
+          </w:p>
+        </w:tc>
+        <w:tc>
+          <w:tcPr>
+            <w:tcW w:w="800" w:type="dxa"/>
+            <w:tcMar>
+              <w:top w:w="100" w:type="dxa"/>
+              <w:bottom w:w="100" w:type="dxa"/>
+              <w:left w:w="120" w:type="dxa"/>
+              <w:right w:w="120" w:type="dxa"/>
+            </w:tcMar>
+          </w:tcPr>
+          <w:p>
+            <w:pPr/>
+            <w:r>
+              <w:rPr>
+                <w:rFonts w:ascii="Segoe UI" w:hAnsi="Segoe UI"/>
+                <w:sz w:val="17"/>
+                <w:color w:val="334155"/>
+              </w:rPr>
+              <w:t>175,0 W</w:t>
+            </w:r>
+          </w:p>
+        </w:tc>
+        <w:tc>
+          <w:tcPr>
+            <w:tcW w:w="600" w:type="dxa"/>
+            <w:tcMar>
+              <w:top w:w="100" w:type="dxa"/>
+              <w:bottom w:w="100" w:type="dxa"/>
+              <w:left w:w="120" w:type="dxa"/>
+              <w:right w:w="120" w:type="dxa"/>
+            </w:tcMar>
+          </w:tcPr>
+          <w:p>
+            <w:pPr/>
+            <w:r>
+              <w:rPr>
+                <w:rFonts w:ascii="Segoe UI" w:hAnsi="Segoe UI"/>
+                <w:sz w:val="17"/>
+                <w:color w:val="334155"/>
+              </w:rPr>
+              <w:t>4</w:t>
+            </w:r>
+          </w:p>
+        </w:tc>
+        <w:tc>
+          <w:tcPr>
+            <w:tcW w:w="1700" w:type="dxa"/>
+            <w:tcMar>
+              <w:top w:w="100" w:type="dxa"/>
+              <w:bottom w:w="100" w:type="dxa"/>
+              <w:left w:w="120" w:type="dxa"/>
+              <w:right w:w="120" w:type="dxa"/>
+            </w:tcMar>
+          </w:tcPr>
+          <w:p>
+            <w:pPr/>
+            <w:r>
+              <w:rPr>
+                <w:rFonts w:ascii="Segoe UI" w:hAnsi="Segoe UI"/>
+                <w:sz w:val="17"/>
+                <w:color w:val="334155"/>
+              </w:rPr>
+              <w:t>48.000 MIPS</w:t>
+            </w:r>
+          </w:p>
+        </w:tc>
+      </w:tr>
+      <w:tr>
+        <w:tc>
+          <w:tcPr>
+            <w:tcW w:w="1800" w:type="dxa"/>
+            <w:tcMar>
+              <w:top w:w="100" w:type="dxa"/>
+              <w:bottom w:w="100" w:type="dxa"/>
+              <w:left w:w="120" w:type="dxa"/>
+              <w:right w:w="120" w:type="dxa"/>
+            </w:tcMar>
+          </w:tcPr>
+          <w:p>
+            <w:pPr/>
+            <w:r>
+              <w:rPr>
+                <w:rFonts w:ascii="Segoe UI" w:hAnsi="Segoe UI"/>
+                <w:sz w:val="17"/>
+                <w:color w:val="334155"/>
+              </w:rPr>
+              <w:t>DC-2: Surabaya (Mid)</w:t>
+            </w:r>
+          </w:p>
+        </w:tc>
+        <w:tc>
+          <w:tcPr>
+            <w:tcW w:w="900" w:type="dxa"/>
+            <w:tcMar>
+              <w:top w:w="100" w:type="dxa"/>
+              <w:bottom w:w="100" w:type="dxa"/>
+              <w:left w:w="120" w:type="dxa"/>
+              <w:right w:w="120" w:type="dxa"/>
+            </w:tcMar>
+          </w:tcPr>
+          <w:p>
+            <w:pPr/>
+            <w:r>
+              <w:rPr>
+                <w:rFonts w:ascii="Segoe UI" w:hAnsi="Segoe UI"/>
+                <w:sz w:val="17"/>
+                <w:color w:val="334155"/>
+              </w:rPr>
+              <w:t>Tipe C</w:t>
+            </w:r>
+          </w:p>
+        </w:tc>
+        <w:tc>
+          <w:tcPr>
+            <w:tcW w:w="500" w:type="dxa"/>
+            <w:tcMar>
+              <w:top w:w="100" w:type="dxa"/>
+              <w:bottom w:w="100" w:type="dxa"/>
+              <w:left w:w="120" w:type="dxa"/>
+              <w:right w:w="120" w:type="dxa"/>
+            </w:tcMar>
+          </w:tcPr>
+          <w:p>
+            <w:pPr/>
+            <w:r>
+              <w:rPr>
+                <w:rFonts w:ascii="Segoe UI" w:hAnsi="Segoe UI"/>
+                <w:sz w:val="17"/>
+                <w:color w:val="334155"/>
+              </w:rPr>
+              <w:t>8</w:t>
+            </w:r>
+          </w:p>
+        </w:tc>
+        <w:tc>
+          <w:tcPr>
+            <w:tcW w:w="900" w:type="dxa"/>
+            <w:tcMar>
+              <w:top w:w="100" w:type="dxa"/>
+              <w:bottom w:w="100" w:type="dxa"/>
+              <w:left w:w="120" w:type="dxa"/>
+              <w:right w:w="120" w:type="dxa"/>
+            </w:tcMar>
+          </w:tcPr>
+          <w:p>
+            <w:pPr/>
+            <w:r>
+              <w:rPr>
+                <w:rFonts w:ascii="Segoe UI" w:hAnsi="Segoe UI"/>
+                <w:sz w:val="17"/>
+                <w:color w:val="334155"/>
+              </w:rPr>
+              <w:t>2.000</w:t>
+            </w:r>
+          </w:p>
+        </w:tc>
+        <w:tc>
+          <w:tcPr>
+            <w:tcW w:w="800" w:type="dxa"/>
+            <w:tcMar>
+              <w:top w:w="100" w:type="dxa"/>
+              <w:bottom w:w="100" w:type="dxa"/>
+              <w:left w:w="120" w:type="dxa"/>
+              <w:right w:w="120" w:type="dxa"/>
+            </w:tcMar>
+          </w:tcPr>
+          <w:p>
+            <w:pPr/>
+            <w:r>
+              <w:rPr>
+                <w:rFonts w:ascii="Segoe UI" w:hAnsi="Segoe UI"/>
+                <w:sz w:val="17"/>
+                <w:color w:val="334155"/>
+              </w:rPr>
+              <w:t>24 GB</w:t>
+            </w:r>
+          </w:p>
+        </w:tc>
+        <w:tc>
+          <w:tcPr>
+            <w:tcW w:w="700" w:type="dxa"/>
+            <w:tcMar>
+              <w:top w:w="100" w:type="dxa"/>
+              <w:bottom w:w="100" w:type="dxa"/>
+              <w:left w:w="120" w:type="dxa"/>
+              <w:right w:w="120" w:type="dxa"/>
+            </w:tcMar>
+          </w:tcPr>
+          <w:p>
+            <w:pPr/>
+            <w:r>
+              <w:rPr>
+                <w:rFonts w:ascii="Segoe UI" w:hAnsi="Segoe UI"/>
+                <w:sz w:val="17"/>
+                <w:color w:val="334155"/>
+              </w:rPr>
+              <w:t>10 Gbps</w:t>
+            </w:r>
+          </w:p>
+        </w:tc>
+        <w:tc>
+          <w:tcPr>
+            <w:tcW w:w="800" w:type="dxa"/>
+            <w:tcMar>
+              <w:top w:w="100" w:type="dxa"/>
+              <w:bottom w:w="100" w:type="dxa"/>
+              <w:left w:w="120" w:type="dxa"/>
+              <w:right w:w="120" w:type="dxa"/>
+            </w:tcMar>
+          </w:tcPr>
+          <w:p>
+            <w:pPr/>
+            <w:r>
+              <w:rPr>
+                <w:rFonts w:ascii="Segoe UI" w:hAnsi="Segoe UI"/>
+                <w:sz w:val="17"/>
+                <w:color w:val="334155"/>
+              </w:rPr>
+              <w:t>120,0 W</w:t>
+            </w:r>
+          </w:p>
+        </w:tc>
+        <w:tc>
+          <w:tcPr>
+            <w:tcW w:w="800" w:type="dxa"/>
+            <w:tcMar>
+              <w:top w:w="100" w:type="dxa"/>
+              <w:bottom w:w="100" w:type="dxa"/>
+              <w:left w:w="120" w:type="dxa"/>
+              <w:right w:w="120" w:type="dxa"/>
+            </w:tcMar>
+          </w:tcPr>
+          <w:p>
+            <w:pPr/>
+            <w:r>
+              <w:rPr>
+                <w:rFonts w:ascii="Segoe UI" w:hAnsi="Segoe UI"/>
+                <w:sz w:val="17"/>
+                <w:color w:val="334155"/>
+              </w:rPr>
+              <w:t>225,0 W</w:t>
+            </w:r>
+          </w:p>
+        </w:tc>
+        <w:tc>
+          <w:tcPr>
+            <w:tcW w:w="600" w:type="dxa"/>
+            <w:tcMar>
+              <w:top w:w="100" w:type="dxa"/>
+              <w:bottom w:w="100" w:type="dxa"/>
+              <w:left w:w="120" w:type="dxa"/>
+              <w:right w:w="120" w:type="dxa"/>
+            </w:tcMar>
+          </w:tcPr>
+          <w:p>
+            <w:pPr/>
+            <w:r>
+              <w:rPr>
+                <w:rFonts w:ascii="Segoe UI" w:hAnsi="Segoe UI"/>
+                <w:sz w:val="17"/>
+                <w:color w:val="334155"/>
+              </w:rPr>
+              <w:t>4</w:t>
+            </w:r>
+          </w:p>
+        </w:tc>
+        <w:tc>
+          <w:tcPr>
+            <w:tcW w:w="1700" w:type="dxa"/>
+            <w:tcMar>
+              <w:top w:w="100" w:type="dxa"/>
+              <w:bottom w:w="100" w:type="dxa"/>
+              <w:left w:w="120" w:type="dxa"/>
+              <w:right w:w="120" w:type="dxa"/>
+            </w:tcMar>
+          </w:tcPr>
+          <w:p>
+            <w:pPr/>
+            <w:r>
+              <w:rPr>
+                <w:rFonts w:ascii="Segoe UI" w:hAnsi="Segoe UI"/>
+                <w:sz w:val="17"/>
+                <w:color w:val="334155"/>
+              </w:rPr>
+              <w:t>64.000 MIPS</w:t>
+            </w:r>
+          </w:p>
+        </w:tc>
+      </w:tr>
+      <w:tr>
+        <w:tc>
+          <w:tcPr>
+            <w:tcW w:w="1800" w:type="dxa"/>
+            <w:tcMar>
+              <w:top w:w="100" w:type="dxa"/>
+              <w:bottom w:w="100" w:type="dxa"/>
+              <w:left w:w="120" w:type="dxa"/>
+              <w:right w:w="120" w:type="dxa"/>
+            </w:tcMar>
+          </w:tcPr>
+          <w:p>
+            <w:pPr/>
+            <w:r>
+              <w:rPr>
+                <w:rFonts w:ascii="Segoe UI" w:hAnsi="Segoe UI"/>
+                <w:sz w:val="17"/>
+                <w:color w:val="334155"/>
+              </w:rPr>
+              <w:t>DC-3: Bandung (High)</w:t>
+            </w:r>
+          </w:p>
+        </w:tc>
+        <w:tc>
+          <w:tcPr>
+            <w:tcW w:w="900" w:type="dxa"/>
+            <w:tcMar>
+              <w:top w:w="100" w:type="dxa"/>
+              <w:bottom w:w="100" w:type="dxa"/>
+              <w:left w:w="120" w:type="dxa"/>
+              <w:right w:w="120" w:type="dxa"/>
+            </w:tcMar>
+          </w:tcPr>
+          <w:p>
+            <w:pPr/>
+            <w:r>
+              <w:rPr>
+                <w:rFonts w:ascii="Segoe UI" w:hAnsi="Segoe UI"/>
+                <w:sz w:val="17"/>
+                <w:color w:val="334155"/>
+              </w:rPr>
+              <w:t>Tipe C</w:t>
+            </w:r>
+          </w:p>
+        </w:tc>
+        <w:tc>
+          <w:tcPr>
+            <w:tcW w:w="500" w:type="dxa"/>
+            <w:tcMar>
+              <w:top w:w="100" w:type="dxa"/>
+              <w:bottom w:w="100" w:type="dxa"/>
+              <w:left w:w="120" w:type="dxa"/>
+              <w:right w:w="120" w:type="dxa"/>
+            </w:tcMar>
+          </w:tcPr>
+          <w:p>
+            <w:pPr/>
+            <w:r>
+              <w:rPr>
+                <w:rFonts w:ascii="Segoe UI" w:hAnsi="Segoe UI"/>
+                <w:sz w:val="17"/>
+                <w:color w:val="334155"/>
+              </w:rPr>
+              <w:t>8</w:t>
+            </w:r>
+          </w:p>
+        </w:tc>
+        <w:tc>
+          <w:tcPr>
+            <w:tcW w:w="900" w:type="dxa"/>
+            <w:tcMar>
+              <w:top w:w="100" w:type="dxa"/>
+              <w:bottom w:w="100" w:type="dxa"/>
+              <w:left w:w="120" w:type="dxa"/>
+              <w:right w:w="120" w:type="dxa"/>
+            </w:tcMar>
+          </w:tcPr>
+          <w:p>
+            <w:pPr/>
+            <w:r>
+              <w:rPr>
+                <w:rFonts w:ascii="Segoe UI" w:hAnsi="Segoe UI"/>
+                <w:sz w:val="17"/>
+                <w:color w:val="334155"/>
+              </w:rPr>
+              <w:t>2.000</w:t>
+            </w:r>
+          </w:p>
+        </w:tc>
+        <w:tc>
+          <w:tcPr>
+            <w:tcW w:w="800" w:type="dxa"/>
+            <w:tcMar>
+              <w:top w:w="100" w:type="dxa"/>
+              <w:bottom w:w="100" w:type="dxa"/>
+              <w:left w:w="120" w:type="dxa"/>
+              <w:right w:w="120" w:type="dxa"/>
+            </w:tcMar>
+          </w:tcPr>
+          <w:p>
+            <w:pPr/>
+            <w:r>
+              <w:rPr>
+                <w:rFonts w:ascii="Segoe UI" w:hAnsi="Segoe UI"/>
+                <w:sz w:val="17"/>
+                <w:color w:val="334155"/>
+              </w:rPr>
+              <w:t>24 GB</w:t>
+            </w:r>
+          </w:p>
+        </w:tc>
+        <w:tc>
+          <w:tcPr>
+            <w:tcW w:w="700" w:type="dxa"/>
+            <w:tcMar>
+              <w:top w:w="100" w:type="dxa"/>
+              <w:bottom w:w="100" w:type="dxa"/>
+              <w:left w:w="120" w:type="dxa"/>
+              <w:right w:w="120" w:type="dxa"/>
+            </w:tcMar>
+          </w:tcPr>
+          <w:p>
+            <w:pPr/>
+            <w:r>
+              <w:rPr>
+                <w:rFonts w:ascii="Segoe UI" w:hAnsi="Segoe UI"/>
+                <w:sz w:val="17"/>
+                <w:color w:val="334155"/>
+              </w:rPr>
+              <w:t>10 Gbps</w:t>
+            </w:r>
+          </w:p>
+        </w:tc>
+        <w:tc>
+          <w:tcPr>
+            <w:tcW w:w="800" w:type="dxa"/>
+            <w:tcMar>
+              <w:top w:w="100" w:type="dxa"/>
+              <w:bottom w:w="100" w:type="dxa"/>
+              <w:left w:w="120" w:type="dxa"/>
+              <w:right w:w="120" w:type="dxa"/>
+            </w:tcMar>
+          </w:tcPr>
+          <w:p>
+            <w:pPr/>
+            <w:r>
+              <w:rPr>
+                <w:rFonts w:ascii="Segoe UI" w:hAnsi="Segoe UI"/>
+                <w:sz w:val="17"/>
+                <w:color w:val="334155"/>
+              </w:rPr>
+              <w:t>120,0 W</w:t>
+            </w:r>
+          </w:p>
+        </w:tc>
+        <w:tc>
+          <w:tcPr>
+            <w:tcW w:w="800" w:type="dxa"/>
+            <w:tcMar>
+              <w:top w:w="100" w:type="dxa"/>
+              <w:bottom w:w="100" w:type="dxa"/>
+              <w:left w:w="120" w:type="dxa"/>
+              <w:right w:w="120" w:type="dxa"/>
+            </w:tcMar>
+          </w:tcPr>
+          <w:p>
+            <w:pPr/>
+            <w:r>
+              <w:rPr>
+                <w:rFonts w:ascii="Segoe UI" w:hAnsi="Segoe UI"/>
+                <w:sz w:val="17"/>
+                <w:color w:val="334155"/>
+              </w:rPr>
+              <w:t>225,0 W</w:t>
+            </w:r>
+          </w:p>
+        </w:tc>
+        <w:tc>
+          <w:tcPr>
+            <w:tcW w:w="600" w:type="dxa"/>
+            <w:tcMar>
+              <w:top w:w="100" w:type="dxa"/>
+              <w:bottom w:w="100" w:type="dxa"/>
+              <w:left w:w="120" w:type="dxa"/>
+              <w:right w:w="120" w:type="dxa"/>
+            </w:tcMar>
+          </w:tcPr>
+          <w:p>
+            <w:pPr/>
+            <w:r>
+              <w:rPr>
+                <w:rFonts w:ascii="Segoe UI" w:hAnsi="Segoe UI"/>
+                <w:sz w:val="17"/>
+                <w:color w:val="334155"/>
+              </w:rPr>
+              <w:t>4</w:t>
+            </w:r>
+          </w:p>
+        </w:tc>
+        <w:tc>
+          <w:tcPr>
+            <w:tcW w:w="1700" w:type="dxa"/>
+            <w:tcMar>
+              <w:top w:w="100" w:type="dxa"/>
+              <w:bottom w:w="100" w:type="dxa"/>
+              <w:left w:w="120" w:type="dxa"/>
+              <w:right w:w="120" w:type="dxa"/>
+            </w:tcMar>
+          </w:tcPr>
+          <w:p>
+            <w:pPr/>
+            <w:r>
+              <w:rPr>
+                <w:rFonts w:ascii="Segoe UI" w:hAnsi="Segoe UI"/>
+                <w:sz w:val="17"/>
+                <w:color w:val="334155"/>
+              </w:rPr>
+              <w:t>64.000 MIPS</w:t>
+            </w:r>
+          </w:p>
+        </w:tc>
+      </w:tr>
+      <w:tr>
+        <w:tc>
+          <w:tcPr>
+            <w:tcW w:w="1800" w:type="dxa"/>
+            <w:tcMar>
+              <w:top w:w="100" w:type="dxa"/>
+              <w:bottom w:w="100" w:type="dxa"/>
+              <w:left w:w="120" w:type="dxa"/>
+              <w:right w:w="120" w:type="dxa"/>
+            </w:tcMar>
+          </w:tcPr>
+          <w:p>
+            <w:pPr/>
+            <w:r>
+              <w:rPr>
+                <w:rFonts w:ascii="Segoe UI" w:hAnsi="Segoe UI"/>
+                <w:sz w:val="17"/>
+                <w:color w:val="334155"/>
+              </w:rPr>
+              <w:t>DC-3: Bandung (High)</w:t>
+            </w:r>
+          </w:p>
+        </w:tc>
+        <w:tc>
+          <w:tcPr>
+            <w:tcW w:w="900" w:type="dxa"/>
+            <w:tcMar>
+              <w:top w:w="100" w:type="dxa"/>
+              <w:bottom w:w="100" w:type="dxa"/>
+              <w:left w:w="120" w:type="dxa"/>
+              <w:right w:w="120" w:type="dxa"/>
+            </w:tcMar>
+          </w:tcPr>
+          <w:p>
+            <w:pPr/>
+            <w:r>
+              <w:rPr>
+                <w:rFonts w:ascii="Segoe UI" w:hAnsi="Segoe UI"/>
+                <w:sz w:val="17"/>
+                <w:color w:val="334155"/>
+              </w:rPr>
+              <w:t>Tipe D</w:t>
+            </w:r>
+          </w:p>
+        </w:tc>
+        <w:tc>
+          <w:tcPr>
+            <w:tcW w:w="500" w:type="dxa"/>
+            <w:tcMar>
+              <w:top w:w="100" w:type="dxa"/>
+              <w:bottom w:w="100" w:type="dxa"/>
+              <w:left w:w="120" w:type="dxa"/>
+              <w:right w:w="120" w:type="dxa"/>
+            </w:tcMar>
+          </w:tcPr>
+          <w:p>
+            <w:pPr/>
+            <w:r>
+              <w:rPr>
+                <w:rFonts w:ascii="Segoe UI" w:hAnsi="Segoe UI"/>
+                <w:sz w:val="17"/>
+                <w:color w:val="334155"/>
+              </w:rPr>
+              <w:t>8</w:t>
+            </w:r>
+          </w:p>
+        </w:tc>
+        <w:tc>
+          <w:tcPr>
+            <w:tcW w:w="900" w:type="dxa"/>
+            <w:tcMar>
+              <w:top w:w="100" w:type="dxa"/>
+              <w:bottom w:w="100" w:type="dxa"/>
+              <w:left w:w="120" w:type="dxa"/>
+              <w:right w:w="120" w:type="dxa"/>
+            </w:tcMar>
+          </w:tcPr>
+          <w:p>
+            <w:pPr/>
+            <w:r>
+              <w:rPr>
+                <w:rFonts w:ascii="Segoe UI" w:hAnsi="Segoe UI"/>
+                <w:sz w:val="17"/>
+                <w:color w:val="334155"/>
+              </w:rPr>
+              <w:t>3.000</w:t>
+            </w:r>
+          </w:p>
+        </w:tc>
+        <w:tc>
+          <w:tcPr>
+            <w:tcW w:w="800" w:type="dxa"/>
+            <w:tcMar>
+              <w:top w:w="100" w:type="dxa"/>
+              <w:bottom w:w="100" w:type="dxa"/>
+              <w:left w:w="120" w:type="dxa"/>
+              <w:right w:w="120" w:type="dxa"/>
+            </w:tcMar>
+          </w:tcPr>
+          <w:p>
+            <w:pPr/>
+            <w:r>
+              <w:rPr>
+                <w:rFonts w:ascii="Segoe UI" w:hAnsi="Segoe UI"/>
+                <w:sz w:val="17"/>
+                <w:color w:val="334155"/>
+              </w:rPr>
+              <w:t>32 GB</w:t>
+            </w:r>
+          </w:p>
+        </w:tc>
+        <w:tc>
+          <w:tcPr>
+            <w:tcW w:w="700" w:type="dxa"/>
+            <w:tcMar>
+              <w:top w:w="100" w:type="dxa"/>
+              <w:bottom w:w="100" w:type="dxa"/>
+              <w:left w:w="120" w:type="dxa"/>
+              <w:right w:w="120" w:type="dxa"/>
+            </w:tcMar>
+          </w:tcPr>
+          <w:p>
+            <w:pPr/>
+            <w:r>
+              <w:rPr>
+                <w:rFonts w:ascii="Segoe UI" w:hAnsi="Segoe UI"/>
+                <w:sz w:val="17"/>
+                <w:color w:val="334155"/>
+              </w:rPr>
+              <w:t>10 Gbps</w:t>
+            </w:r>
+          </w:p>
+        </w:tc>
+        <w:tc>
+          <w:tcPr>
+            <w:tcW w:w="800" w:type="dxa"/>
+            <w:tcMar>
+              <w:top w:w="100" w:type="dxa"/>
+              <w:bottom w:w="100" w:type="dxa"/>
+              <w:left w:w="120" w:type="dxa"/>
+              <w:right w:w="120" w:type="dxa"/>
+            </w:tcMar>
+          </w:tcPr>
+          <w:p>
+            <w:pPr/>
+            <w:r>
+              <w:rPr>
+                <w:rFonts w:ascii="Segoe UI" w:hAnsi="Segoe UI"/>
+                <w:sz w:val="17"/>
+                <w:color w:val="334155"/>
+              </w:rPr>
+              <w:t>140,0 W</w:t>
+            </w:r>
+          </w:p>
+        </w:tc>
+        <w:tc>
+          <w:tcPr>
+            <w:tcW w:w="800" w:type="dxa"/>
+            <w:tcMar>
+              <w:top w:w="100" w:type="dxa"/>
+              <w:bottom w:w="100" w:type="dxa"/>
+              <w:left w:w="120" w:type="dxa"/>
+              <w:right w:w="120" w:type="dxa"/>
+            </w:tcMar>
+          </w:tcPr>
+          <w:p>
+            <w:pPr/>
+            <w:r>
+              <w:rPr>
+                <w:rFonts w:ascii="Segoe UI" w:hAnsi="Segoe UI"/>
+                <w:sz w:val="17"/>
+                <w:color w:val="334155"/>
+              </w:rPr>
+              <w:t>300,0 W</w:t>
+            </w:r>
+          </w:p>
+        </w:tc>
+        <w:tc>
+          <w:tcPr>
+            <w:tcW w:w="600" w:type="dxa"/>
+            <w:tcMar>
+              <w:top w:w="100" w:type="dxa"/>
+              <w:bottom w:w="100" w:type="dxa"/>
+              <w:left w:w="120" w:type="dxa"/>
+              <w:right w:w="120" w:type="dxa"/>
+            </w:tcMar>
+          </w:tcPr>
+          <w:p>
+            <w:pPr/>
+            <w:r>
+              <w:rPr>
+                <w:rFonts w:ascii="Segoe UI" w:hAnsi="Segoe UI"/>
+                <w:sz w:val="17"/>
+                <w:color w:val="334155"/>
+              </w:rPr>
+              <w:t>4</w:t>
+            </w:r>
+          </w:p>
+        </w:tc>
+        <w:tc>
+          <w:tcPr>
+            <w:tcW w:w="1700" w:type="dxa"/>
+            <w:tcMar>
+              <w:top w:w="100" w:type="dxa"/>
+              <w:bottom w:w="100" w:type="dxa"/>
+              <w:left w:w="120" w:type="dxa"/>
+              <w:right w:w="120" w:type="dxa"/>
+            </w:tcMar>
+          </w:tcPr>
+          <w:p>
+            <w:pPr/>
+            <w:r>
+              <w:rPr>
+                <w:rFonts w:ascii="Segoe UI" w:hAnsi="Segoe UI"/>
+                <w:sz w:val="17"/>
+                <w:color w:val="334155"/>
+              </w:rPr>
+              <w:t>96.000 MIPS</w:t>
             </w:r>
           </w:p>
         </w:tc>
       </w:tr>
       <w:tr>
         <w:trPr>
-          <w:trHeight w:hRule="atLeast" w:val="559"/>
+          <w:tblHeader/>
         </w:trPr>
         <w:tc>
           <w:tcPr>
-            <w:tcW w:type="dxa" w:w="1540"/>
+            <w:tcW w:w="1800" w:type="dxa"/>
+            <w:shd w:val="clear" w:color="auto" w:fill="F1F5F9"/>
+            <w:tcMar>
+              <w:top w:w="100" w:type="dxa"/>
+              <w:bottom w:w="100" w:type="dxa"/>
+              <w:left w:w="120" w:type="dxa"/>
+              <w:right w:w="120" w:type="dxa"/>
+            </w:tcMar>
           </w:tcPr>
           <w:p>
             <w:pPr>
-              <w:pStyle w:val="TableParagraph"/>
-              <w:rPr>
-                <w:sz w:val="24"/>
-              </w:rPr>
+              <w:jc w:val="center"/>
             </w:pPr>
             <w:r>
               <w:rPr>
-                <w:sz w:val="24"/>
-              </w:rPr>
-              <w:t>Tipe A</w:t>
-            </w:r>
-          </w:p>
-        </w:tc>
-        <w:tc>
-          <w:tcPr>
-            <w:tcW w:type="dxa" w:w="1880"/>
+                <w:b/>
+                <w:rFonts w:ascii="Segoe UI" w:hAnsi="Segoe UI"/>
+                <w:sz w:val="17"/>
+                <w:color w:val="1E293B"/>
+              </w:rPr>
+              <w:t>Total Multi-DC</w:t>
+            </w:r>
+          </w:p>
+        </w:tc>
+        <w:tc>
+          <w:tcPr>
+            <w:tcW w:w="900" w:type="dxa"/>
+            <w:shd w:val="clear" w:color="auto" w:fill="F1F5F9"/>
+            <w:tcMar>
+              <w:top w:w="100" w:type="dxa"/>
+              <w:bottom w:w="100" w:type="dxa"/>
+              <w:left w:w="120" w:type="dxa"/>
+              <w:right w:w="120" w:type="dxa"/>
+            </w:tcMar>
           </w:tcPr>
           <w:p>
             <w:pPr>
-              <w:pStyle w:val="TableParagraph"/>
-              <w:ind w:left="19"/>
-              <w:rPr>
-                <w:sz w:val="24"/>
-              </w:rPr>
+              <w:jc w:val="center"/>
             </w:pPr>
             <w:r>
               <w:rPr>
-                <w:sz w:val="24"/>
+                <w:b/>
+                <w:rFonts w:ascii="Segoe UI" w:hAnsi="Segoe UI"/>
+                <w:sz w:val="17"/>
+                <w:color w:val="1E293B"/>
+              </w:rPr>
+              <w:t>4 Tipe</w:t>
+            </w:r>
+          </w:p>
+        </w:tc>
+        <w:tc>
+          <w:tcPr>
+            <w:tcW w:w="500" w:type="dxa"/>
+            <w:shd w:val="clear" w:color="auto" w:fill="F1F5F9"/>
+            <w:tcMar>
+              <w:top w:w="100" w:type="dxa"/>
+              <w:bottom w:w="100" w:type="dxa"/>
+              <w:left w:w="120" w:type="dxa"/>
+              <w:right w:w="120" w:type="dxa"/>
+            </w:tcMar>
+          </w:tcPr>
+          <w:p>
+            <w:pPr>
+              <w:jc w:val="center"/>
+            </w:pPr>
+            <w:r>
+              <w:rPr>
+                <w:b/>
+                <w:rFonts w:ascii="Segoe UI" w:hAnsi="Segoe UI"/>
+                <w:sz w:val="17"/>
+                <w:color w:val="1E293B"/>
+              </w:rPr>
+              <w:t>192</w:t>
+            </w:r>
+          </w:p>
+        </w:tc>
+        <w:tc>
+          <w:tcPr>
+            <w:tcW w:w="900" w:type="dxa"/>
+            <w:shd w:val="clear" w:color="auto" w:fill="F1F5F9"/>
+            <w:tcMar>
+              <w:top w:w="100" w:type="dxa"/>
+              <w:bottom w:w="100" w:type="dxa"/>
+              <w:left w:w="120" w:type="dxa"/>
+              <w:right w:w="120" w:type="dxa"/>
+            </w:tcMar>
+          </w:tcPr>
+          <w:p>
+            <w:pPr>
+              <w:jc w:val="center"/>
+            </w:pPr>
+            <w:r>
+              <w:rPr>
+                <w:b/>
+                <w:rFonts w:ascii="Segoe UI" w:hAnsi="Segoe UI"/>
+                <w:sz w:val="17"/>
+                <w:color w:val="1E293B"/>
+              </w:rPr>
+              <w:t>-</w:t>
+            </w:r>
+          </w:p>
+        </w:tc>
+        <w:tc>
+          <w:tcPr>
+            <w:tcW w:w="800" w:type="dxa"/>
+            <w:shd w:val="clear" w:color="auto" w:fill="F1F5F9"/>
+            <w:tcMar>
+              <w:top w:w="100" w:type="dxa"/>
+              <w:bottom w:w="100" w:type="dxa"/>
+              <w:left w:w="120" w:type="dxa"/>
+              <w:right w:w="120" w:type="dxa"/>
+            </w:tcMar>
+          </w:tcPr>
+          <w:p>
+            <w:pPr>
+              <w:jc w:val="center"/>
+            </w:pPr>
+            <w:r>
+              <w:rPr>
+                <w:b/>
+                <w:rFonts w:ascii="Segoe UI" w:hAnsi="Segoe UI"/>
+                <w:sz w:val="17"/>
+                <w:color w:val="1E293B"/>
+              </w:rPr>
+              <w:t>480 GB</w:t>
+            </w:r>
+          </w:p>
+        </w:tc>
+        <w:tc>
+          <w:tcPr>
+            <w:tcW w:w="700" w:type="dxa"/>
+            <w:shd w:val="clear" w:color="auto" w:fill="F1F5F9"/>
+            <w:tcMar>
+              <w:top w:w="100" w:type="dxa"/>
+              <w:bottom w:w="100" w:type="dxa"/>
+              <w:left w:w="120" w:type="dxa"/>
+              <w:right w:w="120" w:type="dxa"/>
+            </w:tcMar>
+          </w:tcPr>
+          <w:p>
+            <w:pPr>
+              <w:jc w:val="center"/>
+            </w:pPr>
+            <w:r>
+              <w:rPr>
+                <w:b/>
+                <w:rFonts w:ascii="Segoe UI" w:hAnsi="Segoe UI"/>
+                <w:sz w:val="17"/>
+                <w:color w:val="1E293B"/>
+              </w:rPr>
+              <w:t>10 Gbps</w:t>
+            </w:r>
+          </w:p>
+        </w:tc>
+        <w:tc>
+          <w:tcPr>
+            <w:tcW w:w="800" w:type="dxa"/>
+            <w:shd w:val="clear" w:color="auto" w:fill="F1F5F9"/>
+            <w:tcMar>
+              <w:top w:w="100" w:type="dxa"/>
+              <w:bottom w:w="100" w:type="dxa"/>
+              <w:left w:w="120" w:type="dxa"/>
+              <w:right w:w="120" w:type="dxa"/>
+            </w:tcMar>
+          </w:tcPr>
+          <w:p>
+            <w:pPr>
+              <w:jc w:val="center"/>
+            </w:pPr>
+            <w:r>
+              <w:rPr>
+                <w:b/>
+                <w:rFonts w:ascii="Segoe UI" w:hAnsi="Segoe UI"/>
+                <w:sz w:val="17"/>
+                <w:color w:val="1E293B"/>
+              </w:rPr>
+              <w:t>-</w:t>
+            </w:r>
+          </w:p>
+        </w:tc>
+        <w:tc>
+          <w:tcPr>
+            <w:tcW w:w="800" w:type="dxa"/>
+            <w:shd w:val="clear" w:color="auto" w:fill="F1F5F9"/>
+            <w:tcMar>
+              <w:top w:w="100" w:type="dxa"/>
+              <w:bottom w:w="100" w:type="dxa"/>
+              <w:left w:w="120" w:type="dxa"/>
+              <w:right w:w="120" w:type="dxa"/>
+            </w:tcMar>
+          </w:tcPr>
+          <w:p>
+            <w:pPr>
+              <w:jc w:val="center"/>
+            </w:pPr>
+            <w:r>
+              <w:rPr>
+                <w:b/>
+                <w:rFonts w:ascii="Segoe UI" w:hAnsi="Segoe UI"/>
+                <w:sz w:val="17"/>
+                <w:color w:val="1E293B"/>
+              </w:rPr>
+              <w:t>-</w:t>
+            </w:r>
+          </w:p>
+        </w:tc>
+        <w:tc>
+          <w:tcPr>
+            <w:tcW w:w="600" w:type="dxa"/>
+            <w:shd w:val="clear" w:color="auto" w:fill="F1F5F9"/>
+            <w:tcMar>
+              <w:top w:w="100" w:type="dxa"/>
+              <w:bottom w:w="100" w:type="dxa"/>
+              <w:left w:w="120" w:type="dxa"/>
+              <w:right w:w="120" w:type="dxa"/>
+            </w:tcMar>
+          </w:tcPr>
+          <w:p>
+            <w:pPr>
+              <w:jc w:val="center"/>
+            </w:pPr>
+            <w:r>
+              <w:rPr>
+                <w:b/>
+                <w:rFonts w:ascii="Segoe UI" w:hAnsi="Segoe UI"/>
+                <w:sz w:val="17"/>
+                <w:color w:val="1E293B"/>
+              </w:rPr>
+              <w:t>24</w:t>
+            </w:r>
+          </w:p>
+        </w:tc>
+        <w:tc>
+          <w:tcPr>
+            <w:tcW w:w="1700" w:type="dxa"/>
+            <w:shd w:val="clear" w:color="auto" w:fill="F1F5F9"/>
+            <w:tcMar>
+              <w:top w:w="100" w:type="dxa"/>
+              <w:bottom w:w="100" w:type="dxa"/>
+              <w:left w:w="120" w:type="dxa"/>
+              <w:right w:w="120" w:type="dxa"/>
+            </w:tcMar>
+          </w:tcPr>
+          <w:p>
+            <w:pPr>
+              <w:jc w:val="center"/>
+            </w:pPr>
+            <w:r>
+              <w:rPr>
+                <w:b/>
+                <w:rFonts w:ascii="Segoe UI" w:hAnsi="Segoe UI"/>
+                <w:sz w:val="17"/>
+                <w:color w:val="1E293B"/>
+              </w:rPr>
+              <w:t>352.000 MIPS</w:t>
+            </w:r>
+          </w:p>
+        </w:tc>
+      </w:tr>
+    </w:tbl>
+    <w:p>
+      <w:pPr>
+        <w:pStyle w:val="BodyText"/>
+        <w:spacing w:before="12" w:line="276" w:lineRule="auto"/>
+        <w:ind/>
+      </w:pPr>
+      <w:r>
+        <w:rPr/>
+        <w:t xml:space="preserve">Setiap host diasumsikan memiliki 8 PE (core) sehingga kapasitas MIPS per host adalah MIPS/core dikali 8. Konfigurasi VM dibagi menjadi tiga kelas, yaitu kecil (1 PE, 1 GB RAM), sedang (2 PE, 4 GB RAM), dan besar (4 PE, 8 GB RAM), dengan jumlah yang didistribusikan proporsional terhadap 30 VM.</w:t>
+      </w:r>
+    </w:p>
+    <w:p>
+      <w:pPr>
+        <w:pStyle w:val="BodyText"/>
+        <w:jc w:val="left"/>
+        <w:rPr>
+          <w:sz w:val="9"/>
+        </w:rPr>
+      </w:pPr>
+    </w:p>
+    <w:tbl>
+      <w:tblPr>
+        <w:tblW w:w="9500" w:type="dxa"/>
+        <w:jc w:val="center"/>
+        <w:tblBorders>
+          <w:top w:val="single" w:sz="4" w:space="0" w:color="CBD5E1"/>
+          <w:left w:val="none"/>
+          <w:bottom w:val="single" w:sz="4" w:space="0" w:color="CBD5E1"/>
+          <w:right w:val="none"/>
+          <w:insideH w:val="single" w:sz="4" w:space="0" w:color="F1F5F9"/>
+          <w:insideV w:val="none"/>
+        </w:tblBorders>
+      </w:tblPr>
+      <w:tr>
+        <w:trPr>
+          <w:tblHeader/>
+        </w:trPr>
+        <w:tc>
+          <w:tcPr>
+            <w:tcW w:w="1700" w:type="dxa"/>
+            <w:shd w:val="clear" w:color="auto" w:fill="F1F5F9"/>
+            <w:tcMar>
+              <w:top w:w="100" w:type="dxa"/>
+              <w:bottom w:w="100" w:type="dxa"/>
+              <w:left w:w="120" w:type="dxa"/>
+              <w:right w:w="120" w:type="dxa"/>
+            </w:tcMar>
+          </w:tcPr>
+          <w:p>
+            <w:pPr>
+              <w:jc w:val="center"/>
+            </w:pPr>
+            <w:r>
+              <w:rPr>
+                <w:b/>
+                <w:rFonts w:ascii="Segoe UI" w:hAnsi="Segoe UI"/>
+                <w:sz w:val="17"/>
+                <w:color w:val="1E293B"/>
+              </w:rPr>
+              <w:t>Datacenter</w:t>
+            </w:r>
+          </w:p>
+        </w:tc>
+        <w:tc>
+          <w:tcPr>
+            <w:tcW w:w="900" w:type="dxa"/>
+            <w:shd w:val="clear" w:color="auto" w:fill="F1F5F9"/>
+            <w:tcMar>
+              <w:top w:w="100" w:type="dxa"/>
+              <w:bottom w:w="100" w:type="dxa"/>
+              <w:left w:w="120" w:type="dxa"/>
+              <w:right w:w="120" w:type="dxa"/>
+            </w:tcMar>
+          </w:tcPr>
+          <w:p>
+            <w:pPr>
+              <w:jc w:val="center"/>
+            </w:pPr>
+            <w:r>
+              <w:rPr>
+                <w:b/>
+                <w:rFonts w:ascii="Segoe UI" w:hAnsi="Segoe UI"/>
+                <w:sz w:val="17"/>
+                <w:color w:val="1E293B"/>
+              </w:rPr>
+              <w:t>Kelas VM</w:t>
+            </w:r>
+          </w:p>
+        </w:tc>
+        <w:tc>
+          <w:tcPr>
+            <w:tcW w:w="700" w:type="dxa"/>
+            <w:shd w:val="clear" w:color="auto" w:fill="F1F5F9"/>
+            <w:tcMar>
+              <w:top w:w="100" w:type="dxa"/>
+              <w:bottom w:w="100" w:type="dxa"/>
+              <w:left w:w="120" w:type="dxa"/>
+              <w:right w:w="120" w:type="dxa"/>
+            </w:tcMar>
+          </w:tcPr>
+          <w:p>
+            <w:pPr>
+              <w:jc w:val="center"/>
+            </w:pPr>
+            <w:r>
+              <w:rPr>
+                <w:b/>
+                <w:rFonts w:ascii="Segoe UI" w:hAnsi="Segoe UI"/>
+                <w:sz w:val="17"/>
+                <w:color w:val="1E293B"/>
+              </w:rPr>
+              <w:t>vCPU (PE)</w:t>
+            </w:r>
+          </w:p>
+        </w:tc>
+        <w:tc>
+          <w:tcPr>
+            <w:tcW w:w="800" w:type="dxa"/>
+            <w:shd w:val="clear" w:color="auto" w:fill="F1F5F9"/>
+            <w:tcMar>
+              <w:top w:w="100" w:type="dxa"/>
+              <w:bottom w:w="100" w:type="dxa"/>
+              <w:left w:w="120" w:type="dxa"/>
+              <w:right w:w="120" w:type="dxa"/>
+            </w:tcMar>
+          </w:tcPr>
+          <w:p>
+            <w:pPr>
+              <w:jc w:val="center"/>
+            </w:pPr>
+            <w:r>
+              <w:rPr>
+                <w:b/>
+                <w:rFonts w:ascii="Segoe UI" w:hAnsi="Segoe UI"/>
+                <w:sz w:val="17"/>
+                <w:color w:val="1E293B"/>
+              </w:rPr>
+              <w:t>MIPS/PE</w:t>
+            </w:r>
+          </w:p>
+        </w:tc>
+        <w:tc>
+          <w:tcPr>
+            <w:tcW w:w="800" w:type="dxa"/>
+            <w:shd w:val="clear" w:color="auto" w:fill="F1F5F9"/>
+            <w:tcMar>
+              <w:top w:w="100" w:type="dxa"/>
+              <w:bottom w:w="100" w:type="dxa"/>
+              <w:left w:w="120" w:type="dxa"/>
+              <w:right w:w="120" w:type="dxa"/>
+            </w:tcMar>
+          </w:tcPr>
+          <w:p>
+            <w:pPr>
+              <w:jc w:val="center"/>
+            </w:pPr>
+            <w:r>
+              <w:rPr>
+                <w:b/>
+                <w:rFonts w:ascii="Segoe UI" w:hAnsi="Segoe UI"/>
+                <w:sz w:val="17"/>
+                <w:color w:val="1E293B"/>
+              </w:rPr>
+              <w:t>RAM</w:t>
+            </w:r>
+          </w:p>
+        </w:tc>
+        <w:tc>
+          <w:tcPr>
+            <w:tcW w:w="700" w:type="dxa"/>
+            <w:shd w:val="clear" w:color="auto" w:fill="F1F5F9"/>
+            <w:tcMar>
+              <w:top w:w="100" w:type="dxa"/>
+              <w:bottom w:w="100" w:type="dxa"/>
+              <w:left w:w="120" w:type="dxa"/>
+              <w:right w:w="120" w:type="dxa"/>
+            </w:tcMar>
+          </w:tcPr>
+          <w:p>
+            <w:pPr>
+              <w:jc w:val="center"/>
+            </w:pPr>
+            <w:r>
+              <w:rPr>
+                <w:b/>
+                <w:rFonts w:ascii="Segoe UI" w:hAnsi="Segoe UI"/>
+                <w:sz w:val="17"/>
+                <w:color w:val="1E293B"/>
+              </w:rPr>
+              <w:t>BW</w:t>
+            </w:r>
+          </w:p>
+        </w:tc>
+        <w:tc>
+          <w:tcPr>
+            <w:tcW w:w="800" w:type="dxa"/>
+            <w:shd w:val="clear" w:color="auto" w:fill="F1F5F9"/>
+            <w:tcMar>
+              <w:top w:w="100" w:type="dxa"/>
+              <w:bottom w:w="100" w:type="dxa"/>
+              <w:left w:w="120" w:type="dxa"/>
+              <w:right w:w="120" w:type="dxa"/>
+            </w:tcMar>
+          </w:tcPr>
+          <w:p>
+            <w:pPr>
+              <w:jc w:val="center"/>
+            </w:pPr>
+            <w:r>
+              <w:rPr>
+                <w:b/>
+                <w:rFonts w:ascii="Segoe UI" w:hAnsi="Segoe UI"/>
+                <w:sz w:val="17"/>
+                <w:color w:val="1E293B"/>
+              </w:rPr>
+              <w:t>Storage</w:t>
+            </w:r>
+          </w:p>
+        </w:tc>
+        <w:tc>
+          <w:tcPr>
+            <w:tcW w:w="600" w:type="dxa"/>
+            <w:shd w:val="clear" w:color="auto" w:fill="F1F5F9"/>
+            <w:tcMar>
+              <w:top w:w="100" w:type="dxa"/>
+              <w:bottom w:w="100" w:type="dxa"/>
+              <w:left w:w="120" w:type="dxa"/>
+              <w:right w:w="120" w:type="dxa"/>
+            </w:tcMar>
+          </w:tcPr>
+          <w:p>
+            <w:pPr>
+              <w:jc w:val="center"/>
+            </w:pPr>
+            <w:r>
+              <w:rPr>
+                <w:b/>
+                <w:rFonts w:ascii="Segoe UI" w:hAnsi="Segoe UI"/>
+                <w:sz w:val="17"/>
+                <w:color w:val="1E293B"/>
+              </w:rPr>
+              <w:t>Unit</w:t>
+            </w:r>
+          </w:p>
+        </w:tc>
+        <w:tc>
+          <w:tcPr>
+            <w:tcW w:w="2500" w:type="dxa"/>
+            <w:shd w:val="clear" w:color="auto" w:fill="F1F5F9"/>
+            <w:tcMar>
+              <w:top w:w="100" w:type="dxa"/>
+              <w:bottom w:w="100" w:type="dxa"/>
+              <w:left w:w="120" w:type="dxa"/>
+              <w:right w:w="120" w:type="dxa"/>
+            </w:tcMar>
+          </w:tcPr>
+          <w:p>
+            <w:pPr>
+              <w:jc w:val="center"/>
+            </w:pPr>
+            <w:r>
+              <w:rPr>
+                <w:b/>
+                <w:rFonts w:ascii="Segoe UI" w:hAnsi="Segoe UI"/>
+                <w:sz w:val="17"/>
+                <w:color w:val="1E293B"/>
+              </w:rPr>
+              <w:t>Alokasi Host (Bebas Nganggur)</w:t>
+            </w:r>
+          </w:p>
+        </w:tc>
+      </w:tr>
+      <w:tr>
+        <w:tc>
+          <w:tcPr>
+            <w:tcW w:w="1700" w:type="dxa"/>
+            <w:tcMar>
+              <w:top w:w="100" w:type="dxa"/>
+              <w:bottom w:w="100" w:type="dxa"/>
+              <w:left w:w="120" w:type="dxa"/>
+              <w:right w:w="120" w:type="dxa"/>
+            </w:tcMar>
+          </w:tcPr>
+          <w:p>
+            <w:pPr/>
+            <w:r>
+              <w:rPr>
+                <w:rFonts w:ascii="Segoe UI" w:hAnsi="Segoe UI"/>
+                <w:sz w:val="17"/>
+                <w:color w:val="334155"/>
+              </w:rPr>
+              <w:t>DC-1 (Jakarta)</w:t>
+            </w:r>
+          </w:p>
+        </w:tc>
+        <w:tc>
+          <w:tcPr>
+            <w:tcW w:w="900" w:type="dxa"/>
+            <w:tcMar>
+              <w:top w:w="100" w:type="dxa"/>
+              <w:bottom w:w="100" w:type="dxa"/>
+              <w:left w:w="120" w:type="dxa"/>
+              <w:right w:w="120" w:type="dxa"/>
+            </w:tcMar>
+          </w:tcPr>
+          <w:p>
+            <w:pPr/>
+            <w:r>
+              <w:rPr>
+                <w:rFonts w:ascii="Segoe UI" w:hAnsi="Segoe UI"/>
+                <w:sz w:val="17"/>
+                <w:color w:val="334155"/>
+              </w:rPr>
+              <w:t>Small</w:t>
+            </w:r>
+          </w:p>
+        </w:tc>
+        <w:tc>
+          <w:tcPr>
+            <w:tcW w:w="700" w:type="dxa"/>
+            <w:tcMar>
+              <w:top w:w="100" w:type="dxa"/>
+              <w:bottom w:w="100" w:type="dxa"/>
+              <w:left w:w="120" w:type="dxa"/>
+              <w:right w:w="120" w:type="dxa"/>
+            </w:tcMar>
+          </w:tcPr>
+          <w:p>
+            <w:pPr/>
+            <w:r>
+              <w:rPr>
+                <w:rFonts w:ascii="Segoe UI" w:hAnsi="Segoe UI"/>
+                <w:sz w:val="17"/>
+                <w:color w:val="334155"/>
+              </w:rPr>
+              <w:t>1 PE</w:t>
+            </w:r>
+          </w:p>
+        </w:tc>
+        <w:tc>
+          <w:tcPr>
+            <w:tcW w:w="800" w:type="dxa"/>
+            <w:tcMar>
+              <w:top w:w="100" w:type="dxa"/>
+              <w:bottom w:w="100" w:type="dxa"/>
+              <w:left w:w="120" w:type="dxa"/>
+              <w:right w:w="120" w:type="dxa"/>
+            </w:tcMar>
+          </w:tcPr>
+          <w:p>
+            <w:pPr/>
+            <w:r>
+              <w:rPr>
+                <w:rFonts w:ascii="Segoe UI" w:hAnsi="Segoe UI"/>
+                <w:sz w:val="17"/>
+                <w:color w:val="334155"/>
               </w:rPr>
               <w:t>1.000</w:t>
             </w:r>
@@ -3025,893 +5052,750 @@
         </w:tc>
         <w:tc>
           <w:tcPr>
-            <w:tcW w:type="dxa" w:w="1820"/>
-          </w:tcPr>
-          <w:p>
-            <w:pPr>
-              <w:pStyle w:val="TableParagraph"/>
-              <w:ind w:left="24"/>
-              <w:rPr>
-                <w:sz w:val="24"/>
-              </w:rPr>
-            </w:pPr>
-            <w:r>
-              <w:rPr>
-                <w:sz w:val="24"/>
-              </w:rPr>
-              <w:t>8</w:t>
-            </w:r>
-          </w:p>
-        </w:tc>
-        <w:tc>
-          <w:tcPr>
-            <w:tcW w:type="dxa" w:w="1900"/>
-          </w:tcPr>
-          <w:p>
-            <w:pPr>
-              <w:pStyle w:val="TableParagraph"/>
-              <w:ind w:left="9"/>
-              <w:rPr>
-                <w:sz w:val="24"/>
-              </w:rPr>
-            </w:pPr>
-            <w:r>
-              <w:rPr>
-                <w:sz w:val="24"/>
-              </w:rPr>
-              <w:t xml:space="preserve">1 Gbps</w:t>
-            </w:r>
-          </w:p>
-        </w:tc>
-        <w:tc>
-          <w:tcPr>
-            <w:tcW w:type="dxa" w:w="2220"/>
-          </w:tcPr>
-          <w:p>
-            <w:pPr>
-              <w:pStyle w:val="TableParagraph"/>
-              <w:ind w:left="14"/>
-              <w:rPr>
-                <w:sz w:val="24"/>
-              </w:rPr>
-            </w:pPr>
-            <w:r>
-              <w:rPr>
-                <w:sz w:val="24"/>
-              </w:rPr>
-              <w:t>2</w:t>
+            <w:tcW w:w="800" w:type="dxa"/>
+            <w:tcMar>
+              <w:top w:w="100" w:type="dxa"/>
+              <w:bottom w:w="100" w:type="dxa"/>
+              <w:left w:w="120" w:type="dxa"/>
+              <w:right w:w="120" w:type="dxa"/>
+            </w:tcMar>
+          </w:tcPr>
+          <w:p>
+            <w:pPr/>
+            <w:r>
+              <w:rPr>
+                <w:rFonts w:ascii="Segoe UI" w:hAnsi="Segoe UI"/>
+                <w:sz w:val="17"/>
+                <w:color w:val="334155"/>
+              </w:rPr>
+              <w:t>1.024 MB</w:t>
+            </w:r>
+          </w:p>
+        </w:tc>
+        <w:tc>
+          <w:tcPr>
+            <w:tcW w:w="700" w:type="dxa"/>
+            <w:tcMar>
+              <w:top w:w="100" w:type="dxa"/>
+              <w:bottom w:w="100" w:type="dxa"/>
+              <w:left w:w="120" w:type="dxa"/>
+              <w:right w:w="120" w:type="dxa"/>
+            </w:tcMar>
+          </w:tcPr>
+          <w:p>
+            <w:pPr/>
+            <w:r>
+              <w:rPr>
+                <w:rFonts w:ascii="Segoe UI" w:hAnsi="Segoe UI"/>
+                <w:sz w:val="17"/>
+                <w:color w:val="334155"/>
+              </w:rPr>
+              <w:t>250 Mbps</w:t>
+            </w:r>
+          </w:p>
+        </w:tc>
+        <w:tc>
+          <w:tcPr>
+            <w:tcW w:w="800" w:type="dxa"/>
+            <w:tcMar>
+              <w:top w:w="100" w:type="dxa"/>
+              <w:bottom w:w="100" w:type="dxa"/>
+              <w:left w:w="120" w:type="dxa"/>
+              <w:right w:w="120" w:type="dxa"/>
+            </w:tcMar>
+          </w:tcPr>
+          <w:p>
+            <w:pPr/>
+            <w:r>
+              <w:rPr>
+                <w:rFonts w:ascii="Segoe UI" w:hAnsi="Segoe UI"/>
+                <w:sz w:val="17"/>
+                <w:color w:val="334155"/>
+              </w:rPr>
+              <w:t>10 GB</w:t>
+            </w:r>
+          </w:p>
+        </w:tc>
+        <w:tc>
+          <w:tcPr>
+            <w:tcW w:w="600" w:type="dxa"/>
+            <w:tcMar>
+              <w:top w:w="100" w:type="dxa"/>
+              <w:bottom w:w="100" w:type="dxa"/>
+              <w:left w:w="120" w:type="dxa"/>
+              <w:right w:w="120" w:type="dxa"/>
+            </w:tcMar>
+          </w:tcPr>
+          <w:p>
+            <w:pPr/>
+            <w:r>
+              <w:rPr>
+                <w:rFonts w:ascii="Segoe UI" w:hAnsi="Segoe UI"/>
+                <w:sz w:val="17"/>
+                <w:color w:val="334155"/>
+              </w:rPr>
+              <w:t>10</w:t>
+            </w:r>
+          </w:p>
+        </w:tc>
+        <w:tc>
+          <w:tcPr>
+            <w:tcW w:w="2500" w:type="dxa"/>
+            <w:tcMar>
+              <w:top w:w="100" w:type="dxa"/>
+              <w:bottom w:w="100" w:type="dxa"/>
+              <w:left w:w="120" w:type="dxa"/>
+              <w:right w:w="120" w:type="dxa"/>
+            </w:tcMar>
+          </w:tcPr>
+          <w:p>
+            <w:pPr/>
+            <w:r>
+              <w:rPr>
+                <w:rFonts w:ascii="Segoe UI" w:hAnsi="Segoe UI"/>
+                <w:sz w:val="17"/>
+                <w:color w:val="334155"/>
+              </w:rPr>
+              <w:t>Host #1-#2: 2 VM, Host #3-#8: 1 VM</w:t>
+            </w:r>
+          </w:p>
+        </w:tc>
+      </w:tr>
+      <w:tr>
+        <w:tc>
+          <w:tcPr>
+            <w:tcW w:w="1700" w:type="dxa"/>
+            <w:tcMar>
+              <w:top w:w="100" w:type="dxa"/>
+              <w:bottom w:w="100" w:type="dxa"/>
+              <w:left w:w="120" w:type="dxa"/>
+              <w:right w:w="120" w:type="dxa"/>
+            </w:tcMar>
+          </w:tcPr>
+          <w:p>
+            <w:pPr/>
+            <w:r>
+              <w:rPr>
+                <w:rFonts w:ascii="Segoe UI" w:hAnsi="Segoe UI"/>
+                <w:sz w:val="17"/>
+                <w:color w:val="334155"/>
+              </w:rPr>
+              <w:t>DC-2 (Surabaya)</w:t>
+            </w:r>
+          </w:p>
+        </w:tc>
+        <w:tc>
+          <w:tcPr>
+            <w:tcW w:w="900" w:type="dxa"/>
+            <w:tcMar>
+              <w:top w:w="100" w:type="dxa"/>
+              <w:bottom w:w="100" w:type="dxa"/>
+              <w:left w:w="120" w:type="dxa"/>
+              <w:right w:w="120" w:type="dxa"/>
+            </w:tcMar>
+          </w:tcPr>
+          <w:p>
+            <w:pPr/>
+            <w:r>
+              <w:rPr>
+                <w:rFonts w:ascii="Segoe UI" w:hAnsi="Segoe UI"/>
+                <w:sz w:val="17"/>
+                <w:color w:val="334155"/>
+              </w:rPr>
+              <w:t>Medium</w:t>
+            </w:r>
+          </w:p>
+        </w:tc>
+        <w:tc>
+          <w:tcPr>
+            <w:tcW w:w="700" w:type="dxa"/>
+            <w:tcMar>
+              <w:top w:w="100" w:type="dxa"/>
+              <w:bottom w:w="100" w:type="dxa"/>
+              <w:left w:w="120" w:type="dxa"/>
+              <w:right w:w="120" w:type="dxa"/>
+            </w:tcMar>
+          </w:tcPr>
+          <w:p>
+            <w:pPr/>
+            <w:r>
+              <w:rPr>
+                <w:rFonts w:ascii="Segoe UI" w:hAnsi="Segoe UI"/>
+                <w:sz w:val="17"/>
+                <w:color w:val="334155"/>
+              </w:rPr>
+              <w:t>2 PE</w:t>
+            </w:r>
+          </w:p>
+        </w:tc>
+        <w:tc>
+          <w:tcPr>
+            <w:tcW w:w="800" w:type="dxa"/>
+            <w:tcMar>
+              <w:top w:w="100" w:type="dxa"/>
+              <w:bottom w:w="100" w:type="dxa"/>
+              <w:left w:w="120" w:type="dxa"/>
+              <w:right w:w="120" w:type="dxa"/>
+            </w:tcMar>
+          </w:tcPr>
+          <w:p>
+            <w:pPr/>
+            <w:r>
+              <w:rPr>
+                <w:rFonts w:ascii="Segoe UI" w:hAnsi="Segoe UI"/>
+                <w:sz w:val="17"/>
+                <w:color w:val="334155"/>
+              </w:rPr>
+              <w:t>1.500</w:t>
+            </w:r>
+          </w:p>
+        </w:tc>
+        <w:tc>
+          <w:tcPr>
+            <w:tcW w:w="800" w:type="dxa"/>
+            <w:tcMar>
+              <w:top w:w="100" w:type="dxa"/>
+              <w:bottom w:w="100" w:type="dxa"/>
+              <w:left w:w="120" w:type="dxa"/>
+              <w:right w:w="120" w:type="dxa"/>
+            </w:tcMar>
+          </w:tcPr>
+          <w:p>
+            <w:pPr/>
+            <w:r>
+              <w:rPr>
+                <w:rFonts w:ascii="Segoe UI" w:hAnsi="Segoe UI"/>
+                <w:sz w:val="17"/>
+                <w:color w:val="334155"/>
+              </w:rPr>
+              <w:t>2.048 MB</w:t>
+            </w:r>
+          </w:p>
+        </w:tc>
+        <w:tc>
+          <w:tcPr>
+            <w:tcW w:w="700" w:type="dxa"/>
+            <w:tcMar>
+              <w:top w:w="100" w:type="dxa"/>
+              <w:bottom w:w="100" w:type="dxa"/>
+              <w:left w:w="120" w:type="dxa"/>
+              <w:right w:w="120" w:type="dxa"/>
+            </w:tcMar>
+          </w:tcPr>
+          <w:p>
+            <w:pPr/>
+            <w:r>
+              <w:rPr>
+                <w:rFonts w:ascii="Segoe UI" w:hAnsi="Segoe UI"/>
+                <w:sz w:val="17"/>
+                <w:color w:val="334155"/>
+              </w:rPr>
+              <w:t>250 Mbps</w:t>
+            </w:r>
+          </w:p>
+        </w:tc>
+        <w:tc>
+          <w:tcPr>
+            <w:tcW w:w="800" w:type="dxa"/>
+            <w:tcMar>
+              <w:top w:w="100" w:type="dxa"/>
+              <w:bottom w:w="100" w:type="dxa"/>
+              <w:left w:w="120" w:type="dxa"/>
+              <w:right w:w="120" w:type="dxa"/>
+            </w:tcMar>
+          </w:tcPr>
+          <w:p>
+            <w:pPr/>
+            <w:r>
+              <w:rPr>
+                <w:rFonts w:ascii="Segoe UI" w:hAnsi="Segoe UI"/>
+                <w:sz w:val="17"/>
+                <w:color w:val="334155"/>
+              </w:rPr>
+              <w:t>10 GB</w:t>
+            </w:r>
+          </w:p>
+        </w:tc>
+        <w:tc>
+          <w:tcPr>
+            <w:tcW w:w="600" w:type="dxa"/>
+            <w:tcMar>
+              <w:top w:w="100" w:type="dxa"/>
+              <w:bottom w:w="100" w:type="dxa"/>
+              <w:left w:w="120" w:type="dxa"/>
+              <w:right w:w="120" w:type="dxa"/>
+            </w:tcMar>
+          </w:tcPr>
+          <w:p>
+            <w:pPr/>
+            <w:r>
+              <w:rPr>
+                <w:rFonts w:ascii="Segoe UI" w:hAnsi="Segoe UI"/>
+                <w:sz w:val="17"/>
+                <w:color w:val="334155"/>
+              </w:rPr>
+              <w:t>10</w:t>
+            </w:r>
+          </w:p>
+        </w:tc>
+        <w:tc>
+          <w:tcPr>
+            <w:tcW w:w="2500" w:type="dxa"/>
+            <w:tcMar>
+              <w:top w:w="100" w:type="dxa"/>
+              <w:bottom w:w="100" w:type="dxa"/>
+              <w:left w:w="120" w:type="dxa"/>
+              <w:right w:w="120" w:type="dxa"/>
+            </w:tcMar>
+          </w:tcPr>
+          <w:p>
+            <w:pPr/>
+            <w:r>
+              <w:rPr>
+                <w:rFonts w:ascii="Segoe UI" w:hAnsi="Segoe UI"/>
+                <w:sz w:val="17"/>
+                <w:color w:val="334155"/>
+              </w:rPr>
+              <w:t>Host #1-#2: 2 VM, Host #3-#8: 1 VM</w:t>
+            </w:r>
+          </w:p>
+        </w:tc>
+      </w:tr>
+      <w:tr>
+        <w:tc>
+          <w:tcPr>
+            <w:tcW w:w="1700" w:type="dxa"/>
+            <w:tcMar>
+              <w:top w:w="100" w:type="dxa"/>
+              <w:bottom w:w="100" w:type="dxa"/>
+              <w:left w:w="120" w:type="dxa"/>
+              <w:right w:w="120" w:type="dxa"/>
+            </w:tcMar>
+          </w:tcPr>
+          <w:p>
+            <w:pPr/>
+            <w:r>
+              <w:rPr>
+                <w:rFonts w:ascii="Segoe UI" w:hAnsi="Segoe UI"/>
+                <w:sz w:val="17"/>
+                <w:color w:val="334155"/>
+              </w:rPr>
+              <w:t>DC-3 (Bandung)</w:t>
+            </w:r>
+          </w:p>
+        </w:tc>
+        <w:tc>
+          <w:tcPr>
+            <w:tcW w:w="900" w:type="dxa"/>
+            <w:tcMar>
+              <w:top w:w="100" w:type="dxa"/>
+              <w:bottom w:w="100" w:type="dxa"/>
+              <w:left w:w="120" w:type="dxa"/>
+              <w:right w:w="120" w:type="dxa"/>
+            </w:tcMar>
+          </w:tcPr>
+          <w:p>
+            <w:pPr/>
+            <w:r>
+              <w:rPr>
+                <w:rFonts w:ascii="Segoe UI" w:hAnsi="Segoe UI"/>
+                <w:sz w:val="17"/>
+                <w:color w:val="334155"/>
+              </w:rPr>
+              <w:t>Large</w:t>
+            </w:r>
+          </w:p>
+        </w:tc>
+        <w:tc>
+          <w:tcPr>
+            <w:tcW w:w="700" w:type="dxa"/>
+            <w:tcMar>
+              <w:top w:w="100" w:type="dxa"/>
+              <w:bottom w:w="100" w:type="dxa"/>
+              <w:left w:w="120" w:type="dxa"/>
+              <w:right w:w="120" w:type="dxa"/>
+            </w:tcMar>
+          </w:tcPr>
+          <w:p>
+            <w:pPr/>
+            <w:r>
+              <w:rPr>
+                <w:rFonts w:ascii="Segoe UI" w:hAnsi="Segoe UI"/>
+                <w:sz w:val="17"/>
+                <w:color w:val="334155"/>
+              </w:rPr>
+              <w:t>4 PE</w:t>
+            </w:r>
+          </w:p>
+        </w:tc>
+        <w:tc>
+          <w:tcPr>
+            <w:tcW w:w="800" w:type="dxa"/>
+            <w:tcMar>
+              <w:top w:w="100" w:type="dxa"/>
+              <w:bottom w:w="100" w:type="dxa"/>
+              <w:left w:w="120" w:type="dxa"/>
+              <w:right w:w="120" w:type="dxa"/>
+            </w:tcMar>
+          </w:tcPr>
+          <w:p>
+            <w:pPr/>
+            <w:r>
+              <w:rPr>
+                <w:rFonts w:ascii="Segoe UI" w:hAnsi="Segoe UI"/>
+                <w:sz w:val="17"/>
+                <w:color w:val="334155"/>
+              </w:rPr>
+              <w:t>2.000</w:t>
+            </w:r>
+          </w:p>
+        </w:tc>
+        <w:tc>
+          <w:tcPr>
+            <w:tcW w:w="800" w:type="dxa"/>
+            <w:tcMar>
+              <w:top w:w="100" w:type="dxa"/>
+              <w:bottom w:w="100" w:type="dxa"/>
+              <w:left w:w="120" w:type="dxa"/>
+              <w:right w:w="120" w:type="dxa"/>
+            </w:tcMar>
+          </w:tcPr>
+          <w:p>
+            <w:pPr/>
+            <w:r>
+              <w:rPr>
+                <w:rFonts w:ascii="Segoe UI" w:hAnsi="Segoe UI"/>
+                <w:sz w:val="17"/>
+                <w:color w:val="334155"/>
+              </w:rPr>
+              <w:t>4.096 MB</w:t>
+            </w:r>
+          </w:p>
+        </w:tc>
+        <w:tc>
+          <w:tcPr>
+            <w:tcW w:w="700" w:type="dxa"/>
+            <w:tcMar>
+              <w:top w:w="100" w:type="dxa"/>
+              <w:bottom w:w="100" w:type="dxa"/>
+              <w:left w:w="120" w:type="dxa"/>
+              <w:right w:w="120" w:type="dxa"/>
+            </w:tcMar>
+          </w:tcPr>
+          <w:p>
+            <w:pPr/>
+            <w:r>
+              <w:rPr>
+                <w:rFonts w:ascii="Segoe UI" w:hAnsi="Segoe UI"/>
+                <w:sz w:val="17"/>
+                <w:color w:val="334155"/>
+              </w:rPr>
+              <w:t>250 Mbps</w:t>
+            </w:r>
+          </w:p>
+        </w:tc>
+        <w:tc>
+          <w:tcPr>
+            <w:tcW w:w="800" w:type="dxa"/>
+            <w:tcMar>
+              <w:top w:w="100" w:type="dxa"/>
+              <w:bottom w:w="100" w:type="dxa"/>
+              <w:left w:w="120" w:type="dxa"/>
+              <w:right w:w="120" w:type="dxa"/>
+            </w:tcMar>
+          </w:tcPr>
+          <w:p>
+            <w:pPr/>
+            <w:r>
+              <w:rPr>
+                <w:rFonts w:ascii="Segoe UI" w:hAnsi="Segoe UI"/>
+                <w:sz w:val="17"/>
+                <w:color w:val="334155"/>
+              </w:rPr>
+              <w:t>10 GB</w:t>
+            </w:r>
+          </w:p>
+        </w:tc>
+        <w:tc>
+          <w:tcPr>
+            <w:tcW w:w="600" w:type="dxa"/>
+            <w:tcMar>
+              <w:top w:w="100" w:type="dxa"/>
+              <w:bottom w:w="100" w:type="dxa"/>
+              <w:left w:w="120" w:type="dxa"/>
+              <w:right w:w="120" w:type="dxa"/>
+            </w:tcMar>
+          </w:tcPr>
+          <w:p>
+            <w:pPr/>
+            <w:r>
+              <w:rPr>
+                <w:rFonts w:ascii="Segoe UI" w:hAnsi="Segoe UI"/>
+                <w:sz w:val="17"/>
+                <w:color w:val="334155"/>
+              </w:rPr>
+              <w:t>10</w:t>
+            </w:r>
+          </w:p>
+        </w:tc>
+        <w:tc>
+          <w:tcPr>
+            <w:tcW w:w="2500" w:type="dxa"/>
+            <w:tcMar>
+              <w:top w:w="100" w:type="dxa"/>
+              <w:bottom w:w="100" w:type="dxa"/>
+              <w:left w:w="120" w:type="dxa"/>
+              <w:right w:w="120" w:type="dxa"/>
+            </w:tcMar>
+          </w:tcPr>
+          <w:p>
+            <w:pPr/>
+            <w:r>
+              <w:rPr>
+                <w:rFonts w:ascii="Segoe UI" w:hAnsi="Segoe UI"/>
+                <w:sz w:val="17"/>
+                <w:color w:val="334155"/>
+              </w:rPr>
+              <w:t>Host #1-#2: 2 VM, Host #3-#8: 1 VM</w:t>
             </w:r>
           </w:p>
         </w:tc>
       </w:tr>
       <w:tr>
         <w:trPr>
-          <w:trHeight w:hRule="atLeast" w:val="559"/>
+          <w:tblHeader/>
         </w:trPr>
         <w:tc>
           <w:tcPr>
-            <w:tcW w:type="dxa" w:w="1540"/>
+            <w:tcW w:w="1700" w:type="dxa"/>
+            <w:shd w:val="clear" w:color="auto" w:fill="F1F5F9"/>
+            <w:tcMar>
+              <w:top w:w="100" w:type="dxa"/>
+              <w:bottom w:w="100" w:type="dxa"/>
+              <w:left w:w="120" w:type="dxa"/>
+              <w:right w:w="120" w:type="dxa"/>
+            </w:tcMar>
           </w:tcPr>
           <w:p>
             <w:pPr>
-              <w:pStyle w:val="TableParagraph"/>
-              <w:spacing w:before="87"/>
-              <w:rPr>
-                <w:sz w:val="24"/>
-              </w:rPr>
+              <w:jc w:val="center"/>
             </w:pPr>
             <w:r>
               <w:rPr>
-                <w:sz w:val="24"/>
-              </w:rPr>
-              <w:t>Tipe B</w:t>
-            </w:r>
-          </w:p>
-        </w:tc>
-        <w:tc>
-          <w:tcPr>
-            <w:tcW w:type="dxa" w:w="1880"/>
+                <w:b/>
+                <w:rFonts w:ascii="Segoe UI" w:hAnsi="Segoe UI"/>
+                <w:sz w:val="17"/>
+                <w:color w:val="1E293B"/>
+              </w:rPr>
+              <w:t>Total Global</w:t>
+            </w:r>
+          </w:p>
+        </w:tc>
+        <w:tc>
+          <w:tcPr>
+            <w:tcW w:w="900" w:type="dxa"/>
+            <w:shd w:val="clear" w:color="auto" w:fill="F1F5F9"/>
+            <w:tcMar>
+              <w:top w:w="100" w:type="dxa"/>
+              <w:bottom w:w="100" w:type="dxa"/>
+              <w:left w:w="120" w:type="dxa"/>
+              <w:right w:w="120" w:type="dxa"/>
+            </w:tcMar>
           </w:tcPr>
           <w:p>
             <w:pPr>
-              <w:pStyle w:val="TableParagraph"/>
-              <w:spacing w:before="87"/>
-              <w:ind w:left="19"/>
-              <w:rPr>
-                <w:sz w:val="24"/>
-              </w:rPr>
+              <w:jc w:val="center"/>
             </w:pPr>
             <w:r>
               <w:rPr>
-                <w:sz w:val="24"/>
-              </w:rPr>
-              <w:t>1.500</w:t>
-            </w:r>
-          </w:p>
-        </w:tc>
-        <w:tc>
-          <w:tcPr>
-            <w:tcW w:type="dxa" w:w="1820"/>
+                <w:b/>
+                <w:rFonts w:ascii="Segoe UI" w:hAnsi="Segoe UI"/>
+                <w:sz w:val="17"/>
+                <w:color w:val="1E293B"/>
+              </w:rPr>
+              <w:t>3 Kelas</w:t>
+            </w:r>
+          </w:p>
+        </w:tc>
+        <w:tc>
+          <w:tcPr>
+            <w:tcW w:w="700" w:type="dxa"/>
+            <w:shd w:val="clear" w:color="auto" w:fill="F1F5F9"/>
+            <w:tcMar>
+              <w:top w:w="100" w:type="dxa"/>
+              <w:bottom w:w="100" w:type="dxa"/>
+              <w:left w:w="120" w:type="dxa"/>
+              <w:right w:w="120" w:type="dxa"/>
+            </w:tcMar>
           </w:tcPr>
           <w:p>
             <w:pPr>
-              <w:pStyle w:val="TableParagraph"/>
-              <w:spacing w:before="87"/>
-              <w:ind w:left="24"/>
-              <w:rPr>
-                <w:sz w:val="24"/>
-              </w:rPr>
+              <w:jc w:val="center"/>
             </w:pPr>
             <w:r>
               <w:rPr>
-                <w:sz w:val="24"/>
-              </w:rPr>
-              <w:t>16</w:t>
-            </w:r>
-          </w:p>
-        </w:tc>
-        <w:tc>
-          <w:tcPr>
-            <w:tcW w:type="dxa" w:w="1900"/>
+                <w:b/>
+                <w:rFonts w:ascii="Segoe UI" w:hAnsi="Segoe UI"/>
+                <w:sz w:val="17"/>
+                <w:color w:val="1E293B"/>
+              </w:rPr>
+              <w:t>70 PE</w:t>
+            </w:r>
+          </w:p>
+        </w:tc>
+        <w:tc>
+          <w:tcPr>
+            <w:tcW w:w="800" w:type="dxa"/>
+            <w:shd w:val="clear" w:color="auto" w:fill="F1F5F9"/>
+            <w:tcMar>
+              <w:top w:w="100" w:type="dxa"/>
+              <w:bottom w:w="100" w:type="dxa"/>
+              <w:left w:w="120" w:type="dxa"/>
+              <w:right w:w="120" w:type="dxa"/>
+            </w:tcMar>
           </w:tcPr>
           <w:p>
             <w:pPr>
-              <w:pStyle w:val="TableParagraph"/>
-              <w:spacing w:before="87"/>
-              <w:ind w:left="9"/>
-              <w:rPr>
-                <w:sz w:val="24"/>
-              </w:rPr>
+              <w:jc w:val="center"/>
             </w:pPr>
             <w:r>
               <w:rPr>
-                <w:sz w:val="24"/>
-              </w:rPr>
-              <w:t xml:space="preserve">1 Gbps</w:t>
-            </w:r>
-          </w:p>
-        </w:tc>
-        <w:tc>
-          <w:tcPr>
-            <w:tcW w:type="dxa" w:w="2220"/>
+                <w:b/>
+                <w:rFonts w:ascii="Segoe UI" w:hAnsi="Segoe UI"/>
+                <w:sz w:val="17"/>
+                <w:color w:val="1E293B"/>
+              </w:rPr>
+              <w:t>-</w:t>
+            </w:r>
+          </w:p>
+        </w:tc>
+        <w:tc>
+          <w:tcPr>
+            <w:tcW w:w="800" w:type="dxa"/>
+            <w:shd w:val="clear" w:color="auto" w:fill="F1F5F9"/>
+            <w:tcMar>
+              <w:top w:w="100" w:type="dxa"/>
+              <w:bottom w:w="100" w:type="dxa"/>
+              <w:left w:w="120" w:type="dxa"/>
+              <w:right w:w="120" w:type="dxa"/>
+            </w:tcMar>
           </w:tcPr>
           <w:p>
             <w:pPr>
-              <w:pStyle w:val="TableParagraph"/>
-              <w:spacing w:before="87"/>
-              <w:ind w:left="14"/>
-              <w:rPr>
-                <w:sz w:val="24"/>
-              </w:rPr>
+              <w:jc w:val="center"/>
             </w:pPr>
             <w:r>
               <w:rPr>
-                <w:sz w:val="24"/>
-              </w:rPr>
-              <w:t>2</w:t>
-            </w:r>
-          </w:p>
-        </w:tc>
-      </w:tr>
-      <w:tr>
-        <w:trPr>
-          <w:trHeight w:hRule="atLeast" w:val="559"/>
-        </w:trPr>
-        <w:tc>
-          <w:tcPr>
-            <w:tcW w:type="dxa" w:w="1540"/>
+                <w:b/>
+                <w:rFonts w:ascii="Segoe UI" w:hAnsi="Segoe UI"/>
+                <w:sz w:val="17"/>
+                <w:color w:val="1E293B"/>
+              </w:rPr>
+              <w:t>71.680 MB</w:t>
+            </w:r>
+          </w:p>
+        </w:tc>
+        <w:tc>
+          <w:tcPr>
+            <w:tcW w:w="700" w:type="dxa"/>
+            <w:shd w:val="clear" w:color="auto" w:fill="F1F5F9"/>
+            <w:tcMar>
+              <w:top w:w="100" w:type="dxa"/>
+              <w:bottom w:w="100" w:type="dxa"/>
+              <w:left w:w="120" w:type="dxa"/>
+              <w:right w:w="120" w:type="dxa"/>
+            </w:tcMar>
           </w:tcPr>
           <w:p>
             <w:pPr>
-              <w:pStyle w:val="TableParagraph"/>
-              <w:spacing w:before="86"/>
-              <w:rPr>
-                <w:sz w:val="24"/>
-              </w:rPr>
+              <w:jc w:val="center"/>
             </w:pPr>
             <w:r>
               <w:rPr>
-                <w:sz w:val="24"/>
-              </w:rPr>
-              <w:t>Tipe C</w:t>
-            </w:r>
-          </w:p>
-        </w:tc>
-        <w:tc>
-          <w:tcPr>
-            <w:tcW w:type="dxa" w:w="1880"/>
+                <w:b/>
+                <w:rFonts w:ascii="Segoe UI" w:hAnsi="Segoe UI"/>
+                <w:sz w:val="17"/>
+                <w:color w:val="1E293B"/>
+              </w:rPr>
+              <w:t>250 Mbps</w:t>
+            </w:r>
+          </w:p>
+        </w:tc>
+        <w:tc>
+          <w:tcPr>
+            <w:tcW w:w="800" w:type="dxa"/>
+            <w:shd w:val="clear" w:color="auto" w:fill="F1F5F9"/>
+            <w:tcMar>
+              <w:top w:w="100" w:type="dxa"/>
+              <w:bottom w:w="100" w:type="dxa"/>
+              <w:left w:w="120" w:type="dxa"/>
+              <w:right w:w="120" w:type="dxa"/>
+            </w:tcMar>
           </w:tcPr>
           <w:p>
             <w:pPr>
-              <w:pStyle w:val="TableParagraph"/>
-              <w:spacing w:before="86"/>
-              <w:ind w:left="19"/>
-              <w:rPr>
-                <w:sz w:val="24"/>
-              </w:rPr>
+              <w:jc w:val="center"/>
             </w:pPr>
             <w:r>
               <w:rPr>
-                <w:sz w:val="24"/>
-              </w:rPr>
-              <w:t>2.000</w:t>
-            </w:r>
-          </w:p>
-        </w:tc>
-        <w:tc>
-          <w:tcPr>
-            <w:tcW w:type="dxa" w:w="1820"/>
+                <w:b/>
+                <w:rFonts w:ascii="Segoe UI" w:hAnsi="Segoe UI"/>
+                <w:sz w:val="17"/>
+                <w:color w:val="1E293B"/>
+              </w:rPr>
+              <w:t>300 GB</w:t>
+            </w:r>
+          </w:p>
+        </w:tc>
+        <w:tc>
+          <w:tcPr>
+            <w:tcW w:w="600" w:type="dxa"/>
+            <w:shd w:val="clear" w:color="auto" w:fill="F1F5F9"/>
+            <w:tcMar>
+              <w:top w:w="100" w:type="dxa"/>
+              <w:bottom w:w="100" w:type="dxa"/>
+              <w:left w:w="120" w:type="dxa"/>
+              <w:right w:w="120" w:type="dxa"/>
+            </w:tcMar>
           </w:tcPr>
           <w:p>
             <w:pPr>
-              <w:pStyle w:val="TableParagraph"/>
-              <w:spacing w:before="86"/>
-              <w:ind w:left="24"/>
-              <w:rPr>
-                <w:sz w:val="24"/>
-              </w:rPr>
+              <w:jc w:val="center"/>
             </w:pPr>
             <w:r>
               <w:rPr>
-                <w:sz w:val="24"/>
-              </w:rPr>
-              <w:t>24</w:t>
-            </w:r>
-          </w:p>
-        </w:tc>
-        <w:tc>
-          <w:tcPr>
-            <w:tcW w:type="dxa" w:w="1900"/>
+                <w:b/>
+                <w:rFonts w:ascii="Segoe UI" w:hAnsi="Segoe UI"/>
+                <w:sz w:val="17"/>
+                <w:color w:val="1E293B"/>
+              </w:rPr>
+              <w:t>30</w:t>
+            </w:r>
+          </w:p>
+        </w:tc>
+        <w:tc>
+          <w:tcPr>
+            <w:tcW w:w="2500" w:type="dxa"/>
+            <w:shd w:val="clear" w:color="auto" w:fill="F1F5F9"/>
+            <w:tcMar>
+              <w:top w:w="100" w:type="dxa"/>
+              <w:bottom w:w="100" w:type="dxa"/>
+              <w:left w:w="120" w:type="dxa"/>
+              <w:right w:w="120" w:type="dxa"/>
+            </w:tcMar>
           </w:tcPr>
           <w:p>
             <w:pPr>
-              <w:pStyle w:val="TableParagraph"/>
-              <w:spacing w:before="86"/>
-              <w:ind w:left="9"/>
-              <w:rPr>
-                <w:sz w:val="24"/>
-              </w:rPr>
+              <w:jc w:val="center"/>
             </w:pPr>
             <w:r>
               <w:rPr>
-                <w:sz w:val="24"/>
-              </w:rPr>
-              <w:t xml:space="preserve">10 Gbps</w:t>
-            </w:r>
-          </w:p>
-        </w:tc>
-        <w:tc>
-          <w:tcPr>
-            <w:tcW w:type="dxa" w:w="2220"/>
-          </w:tcPr>
-          <w:p>
-            <w:pPr>
-              <w:pStyle w:val="TableParagraph"/>
-              <w:spacing w:before="86"/>
-              <w:ind w:left="14"/>
-              <w:rPr>
-                <w:sz w:val="24"/>
-              </w:rPr>
-            </w:pPr>
-            <w:r>
-              <w:rPr>
-                <w:sz w:val="24"/>
-              </w:rPr>
-              <w:t>2</w:t>
-            </w:r>
-          </w:p>
-        </w:tc>
-      </w:tr>
-      <w:tr>
-        <w:trPr>
-          <w:trHeight w:hRule="atLeast" w:val="560"/>
-        </w:trPr>
-        <w:tc>
-          <w:tcPr>
-            <w:tcW w:type="dxa" w:w="1540"/>
-          </w:tcPr>
-          <w:p>
-            <w:pPr>
-              <w:pStyle w:val="TableParagraph"/>
-              <w:spacing w:before="85"/>
-              <w:rPr>
-                <w:sz w:val="24"/>
-              </w:rPr>
-            </w:pPr>
-            <w:r>
-              <w:rPr>
-                <w:sz w:val="24"/>
-              </w:rPr>
-              <w:t>Tipe D</w:t>
-            </w:r>
-          </w:p>
-        </w:tc>
-        <w:tc>
-          <w:tcPr>
-            <w:tcW w:type="dxa" w:w="1880"/>
-          </w:tcPr>
-          <w:p>
-            <w:pPr>
-              <w:pStyle w:val="TableParagraph"/>
-              <w:spacing w:before="85"/>
-              <w:ind w:left="19"/>
-              <w:rPr>
-                <w:sz w:val="24"/>
-              </w:rPr>
-            </w:pPr>
-            <w:r>
-              <w:rPr>
-                <w:sz w:val="24"/>
-              </w:rPr>
-              <w:t>3.000</w:t>
-            </w:r>
-          </w:p>
-        </w:tc>
-        <w:tc>
-          <w:tcPr>
-            <w:tcW w:type="dxa" w:w="1820"/>
-          </w:tcPr>
-          <w:p>
-            <w:pPr>
-              <w:pStyle w:val="TableParagraph"/>
-              <w:spacing w:before="85"/>
-              <w:ind w:left="24"/>
-              <w:rPr>
-                <w:sz w:val="24"/>
-              </w:rPr>
-            </w:pPr>
-            <w:r>
-              <w:rPr>
-                <w:sz w:val="24"/>
-              </w:rPr>
-              <w:t>32</w:t>
-            </w:r>
-          </w:p>
-        </w:tc>
-        <w:tc>
-          <w:tcPr>
-            <w:tcW w:type="dxa" w:w="1900"/>
-          </w:tcPr>
-          <w:p>
-            <w:pPr>
-              <w:pStyle w:val="TableParagraph"/>
-              <w:spacing w:before="85"/>
-              <w:ind w:left="9"/>
-              <w:rPr>
-                <w:sz w:val="24"/>
-              </w:rPr>
-            </w:pPr>
-            <w:r>
-              <w:rPr>
-                <w:sz w:val="24"/>
-              </w:rPr>
-              <w:t xml:space="preserve">10 Gbps</w:t>
-            </w:r>
-          </w:p>
-        </w:tc>
-        <w:tc>
-          <w:tcPr>
-            <w:tcW w:type="dxa" w:w="2220"/>
-          </w:tcPr>
-          <w:p>
-            <w:pPr>
-              <w:pStyle w:val="TableParagraph"/>
-              <w:spacing w:before="85"/>
-              <w:ind w:left="14"/>
-              <w:rPr>
-                <w:sz w:val="24"/>
-              </w:rPr>
-            </w:pPr>
-            <w:r>
-              <w:rPr>
-                <w:sz w:val="24"/>
-              </w:rPr>
-              <w:t>2</w:t>
-            </w:r>
-          </w:p>
-        </w:tc>
-      </w:tr>
-    </w:tbl>
-    <w:p>
-      <w:pPr>
-        <w:pStyle w:val="BodyText"/>
-        <w:spacing w:before="12" w:line="276" w:lineRule="auto"/>
-        <w:ind/>
-      </w:pPr>
-      <w:r>
-        <w:rPr/>
-        <w:t xml:space="preserve">Setiap host diasumsikan memiliki 8 PE (core) sehingga kapasitas MIPS per host adalah MIPS/core dikali 8. Konfigurasi VM dibagi menjadi tiga kelas, yaitu kecil (1 PE, 1 GB RAM), sedang (2 PE, 4 GB RAM), dan besar (4 PE, 8 GB RAM), dengan jumlah yang didistribusikan proporsional terhadap 30 VM.</w:t>
-      </w:r>
-    </w:p>
-    <w:p>
-      <w:pPr>
-        <w:pStyle w:val="BodyText"/>
-        <w:jc w:val="left"/>
-        <w:rPr>
-          <w:sz w:val="9"/>
-        </w:rPr>
-      </w:pPr>
-    </w:p>
-    <w:tbl>
-      <w:tblPr>
-        <w:tblW w:type="auto" w:w="0"/>
-        <w:jc w:val="left"/>
-        <w:tblInd w:type="dxa" w:w="10"/>
-        <w:tblBorders>
-          <w:top w:color="BEBEBE" w:space="0" w:sz="8" w:val="single"/>
-          <w:left w:color="BEBEBE" w:space="0" w:sz="8" w:val="single"/>
-          <w:bottom w:color="BEBEBE" w:space="0" w:sz="8" w:val="single"/>
-          <w:right w:color="BEBEBE" w:space="0" w:sz="8" w:val="single"/>
-          <w:insideH w:color="BEBEBE" w:space="0" w:sz="8" w:val="single"/>
-          <w:insideV w:color="BEBEBE" w:space="0" w:sz="8" w:val="single"/>
-        </w:tblBorders>
-        <w:tblLayout w:type="fixed"/>
-        <w:tblCellMar>
-          <w:top w:type="dxa" w:w="0"/>
-          <w:left w:type="dxa" w:w="0"/>
-          <w:bottom w:type="dxa" w:w="0"/>
-          <w:right w:type="dxa" w:w="0"/>
-        </w:tblCellMar>
-        <w:tblLook w:val="01E0"/>
-      </w:tblPr>
-      <w:tblGrid>
-        <w:gridCol w:w="1540"/>
-        <w:gridCol w:w="2800"/>
-        <w:gridCol w:w="2560"/>
-        <w:gridCol w:w="2400"/>
-      </w:tblGrid>
-      <w:tr>
-        <w:trPr>
-          <w:trHeight w:hRule="atLeast" w:val="560"/>
-        </w:trPr>
-        <w:tc>
-          <w:tcPr>
-            <w:tcW w:type="dxa" w:w="1540"/>
-            <w:shd w:color="auto" w:fill="F1F1F1" w:val="clear"/>
-          </w:tcPr>
-          <w:p>
-            <w:pPr>
-              <w:pStyle w:val="TableParagraph"/>
-              <w:spacing w:before="94"/>
-              <w:rPr>
-                <w:rFonts w:ascii="Poppins"/>
-                <w:sz w:val="24"/>
-              </w:rPr>
-            </w:pPr>
-            <w:r>
-              <w:rPr>
-                <w:rFonts w:ascii="Poppins"/>
-                <w:sz w:val="24"/>
-              </w:rPr>
-              <w:t xml:space="preserve">Tipe VM</w:t>
-            </w:r>
-          </w:p>
-        </w:tc>
-        <w:tc>
-          <w:tcPr>
-            <w:tcW w:type="dxa" w:w="2800"/>
-            <w:shd w:color="auto" w:fill="F1F1F1" w:val="clear"/>
-          </w:tcPr>
-          <w:p>
-            <w:pPr>
-              <w:pStyle w:val="TableParagraph"/>
-              <w:spacing w:before="94"/>
-              <w:ind w:left="14"/>
-              <w:rPr>
-                <w:rFonts w:ascii="Poppins"/>
-                <w:sz w:val="24"/>
-              </w:rPr>
-            </w:pPr>
-            <w:r>
-              <w:rPr>
-                <w:rFonts w:ascii="Poppins"/>
-                <w:sz w:val="24"/>
-              </w:rPr>
-              <w:t>PE</w:t>
-            </w:r>
-          </w:p>
-        </w:tc>
-        <w:tc>
-          <w:tcPr>
-            <w:tcW w:type="dxa" w:w="2560"/>
-            <w:shd w:color="auto" w:fill="F1F1F1" w:val="clear"/>
-          </w:tcPr>
-          <w:p>
-            <w:pPr>
-              <w:pStyle w:val="TableParagraph"/>
-              <w:spacing w:before="94"/>
-              <w:ind w:left="24"/>
-              <w:rPr>
-                <w:rFonts w:ascii="Poppins"/>
-                <w:sz w:val="24"/>
-              </w:rPr>
-            </w:pPr>
-            <w:r>
-              <w:rPr>
-                <w:rFonts w:ascii="Poppins"/>
-                <w:sz w:val="24"/>
-              </w:rPr>
-              <w:t xml:space="preserve">RAM (GB)</w:t>
-            </w:r>
-          </w:p>
-        </w:tc>
-        <w:tc>
-          <w:tcPr>
-            <w:tcW w:type="dxa" w:w="2400"/>
-            <w:shd w:color="auto" w:fill="F1F1F1" w:val="clear"/>
-          </w:tcPr>
-          <w:p>
-            <w:pPr>
-              <w:pStyle w:val="TableParagraph"/>
-              <w:spacing w:before="94"/>
-              <w:ind w:left="14"/>
-              <w:rPr>
-                <w:rFonts w:ascii="Poppins"/>
-                <w:sz w:val="24"/>
-              </w:rPr>
-            </w:pPr>
-            <w:r>
-              <w:rPr>
-                <w:rFonts w:ascii="Poppins"/>
-                <w:sz w:val="24"/>
-              </w:rPr>
-              <w:t>Jumlah</w:t>
-            </w:r>
-          </w:p>
-        </w:tc>
-      </w:tr>
-      <w:tr>
-        <w:trPr>
-          <w:trHeight w:hRule="atLeast" w:val="559"/>
-        </w:trPr>
-        <w:tc>
-          <w:tcPr>
-            <w:tcW w:type="dxa" w:w="1540"/>
-          </w:tcPr>
-          <w:p>
-            <w:pPr>
-              <w:pStyle w:val="TableParagraph"/>
-              <w:spacing w:before="94"/>
-              <w:rPr>
-                <w:sz w:val="24"/>
-              </w:rPr>
-            </w:pPr>
-            <w:r>
-              <w:rPr>
-                <w:sz w:val="24"/>
-              </w:rPr>
-              <w:t>Small</w:t>
-            </w:r>
-          </w:p>
-        </w:tc>
-        <w:tc>
-          <w:tcPr>
-            <w:tcW w:type="dxa" w:w="2800"/>
-          </w:tcPr>
-          <w:p>
-            <w:pPr>
-              <w:pStyle w:val="TableParagraph"/>
-              <w:spacing w:before="94"/>
-              <w:ind w:left="14"/>
-              <w:rPr>
-                <w:sz w:val="24"/>
-              </w:rPr>
-            </w:pPr>
-            <w:r>
-              <w:rPr>
-                <w:sz w:val="24"/>
-              </w:rPr>
-              <w:t>1</w:t>
-            </w:r>
-          </w:p>
-        </w:tc>
-        <w:tc>
-          <w:tcPr>
-            <w:tcW w:type="dxa" w:w="2560"/>
-          </w:tcPr>
-          <w:p>
-            <w:pPr>
-              <w:pStyle w:val="TableParagraph"/>
-              <w:spacing w:before="94"/>
-              <w:ind w:left="24"/>
-              <w:rPr>
-                <w:sz w:val="24"/>
-              </w:rPr>
-            </w:pPr>
-            <w:r>
-              <w:rPr>
-                <w:sz w:val="24"/>
-              </w:rPr>
-              <w:t>1</w:t>
-            </w:r>
-          </w:p>
-        </w:tc>
-        <w:tc>
-          <w:tcPr>
-            <w:tcW w:type="dxa" w:w="2400"/>
-          </w:tcPr>
-          <w:p>
-            <w:pPr>
-              <w:pStyle w:val="TableParagraph"/>
-              <w:spacing w:before="94"/>
-              <w:ind w:left="14"/>
-              <w:rPr>
-                <w:sz w:val="24"/>
-              </w:rPr>
-            </w:pPr>
-            <w:r>
-              <w:rPr>
-                <w:sz w:val="24"/>
-              </w:rPr>
-              <w:t>10</w:t>
-            </w:r>
-          </w:p>
-        </w:tc>
-      </w:tr>
-      <w:tr>
-        <w:trPr>
-          <w:trHeight w:hRule="atLeast" w:val="560"/>
-        </w:trPr>
-        <w:tc>
-          <w:tcPr>
-            <w:tcW w:type="dxa" w:w="1540"/>
-          </w:tcPr>
-          <w:p>
-            <w:pPr>
-              <w:pStyle w:val="TableParagraph"/>
-              <w:spacing w:before="93"/>
-              <w:rPr>
-                <w:sz w:val="24"/>
-              </w:rPr>
-            </w:pPr>
-            <w:r>
-              <w:rPr>
-                <w:sz w:val="24"/>
-              </w:rPr>
-              <w:t>Medium</w:t>
-            </w:r>
-          </w:p>
-        </w:tc>
-        <w:tc>
-          <w:tcPr>
-            <w:tcW w:type="dxa" w:w="2800"/>
-          </w:tcPr>
-          <w:p>
-            <w:pPr>
-              <w:pStyle w:val="TableParagraph"/>
-              <w:spacing w:before="93"/>
-              <w:ind w:left="14"/>
-              <w:rPr>
-                <w:sz w:val="24"/>
-              </w:rPr>
-            </w:pPr>
-            <w:r>
-              <w:rPr>
-                <w:sz w:val="24"/>
-              </w:rPr>
-              <w:t>2</w:t>
-            </w:r>
-          </w:p>
-        </w:tc>
-        <w:tc>
-          <w:tcPr>
-            <w:tcW w:type="dxa" w:w="2560"/>
-          </w:tcPr>
-          <w:p>
-            <w:pPr>
-              <w:pStyle w:val="TableParagraph"/>
-              <w:spacing w:before="93"/>
-              <w:ind w:left="24"/>
-              <w:rPr>
-                <w:sz w:val="24"/>
-              </w:rPr>
-            </w:pPr>
-            <w:r>
-              <w:rPr>
-                <w:sz w:val="24"/>
-              </w:rPr>
-              <w:t>4</w:t>
-            </w:r>
-          </w:p>
-        </w:tc>
-        <w:tc>
-          <w:tcPr>
-            <w:tcW w:type="dxa" w:w="2400"/>
-          </w:tcPr>
-          <w:p>
-            <w:pPr>
-              <w:pStyle w:val="TableParagraph"/>
-              <w:spacing w:before="93"/>
-              <w:ind w:left="14"/>
-              <w:rPr>
-                <w:sz w:val="24"/>
-              </w:rPr>
-            </w:pPr>
-            <w:r>
-              <w:rPr>
-                <w:sz w:val="24"/>
-              </w:rPr>
-              <w:t>10</w:t>
-            </w:r>
-          </w:p>
-        </w:tc>
-      </w:tr>
-    </w:tbl>
-    <w:p>
-      <w:pPr>
-        <w:pStyle w:val="TableParagraph"/>
-        <w:spacing w:after="0"/>
-        <w:rPr>
-          <w:sz w:val="24"/>
-        </w:rPr>
-        <w:sectPr>
-          <w:pgSz w:h="15840" w:w="12240"/>
-          <w:pgMar w:bottom="1651" w:left="1440" w:right="1080" w:top="1420"/>
-        </w:sectPr>
-      </w:pPr>
-    </w:p>
-    <w:tbl>
-      <w:tblPr>
-        <w:tblW w:type="auto" w:w="0"/>
-        <w:jc w:val="left"/>
-        <w:tblInd w:type="dxa" w:w="10"/>
-        <w:tblBorders>
-          <w:top w:color="BEBEBE" w:space="0" w:sz="8" w:val="single"/>
-          <w:left w:color="BEBEBE" w:space="0" w:sz="8" w:val="single"/>
-          <w:bottom w:color="BEBEBE" w:space="0" w:sz="8" w:val="single"/>
-          <w:right w:color="BEBEBE" w:space="0" w:sz="8" w:val="single"/>
-          <w:insideH w:color="BEBEBE" w:space="0" w:sz="8" w:val="single"/>
-          <w:insideV w:color="BEBEBE" w:space="0" w:sz="8" w:val="single"/>
-        </w:tblBorders>
-        <w:tblLayout w:type="fixed"/>
-        <w:tblCellMar>
-          <w:top w:type="dxa" w:w="0"/>
-          <w:left w:type="dxa" w:w="0"/>
-          <w:bottom w:type="dxa" w:w="0"/>
-          <w:right w:type="dxa" w:w="0"/>
-        </w:tblCellMar>
-        <w:tblLook w:val="01E0"/>
-      </w:tblPr>
-      <w:tblGrid>
-        <w:gridCol w:w="1540"/>
-        <w:gridCol w:w="2800"/>
-        <w:gridCol w:w="2560"/>
-        <w:gridCol w:w="2400"/>
-      </w:tblGrid>
-      <w:tr>
-        <w:trPr>
-          <w:trHeight w:hRule="atLeast" w:val="539"/>
-        </w:trPr>
-        <w:tc>
-          <w:tcPr>
-            <w:tcW w:type="dxa" w:w="1540"/>
-          </w:tcPr>
-          <w:p>
-            <w:pPr>
-              <w:pStyle w:val="TableParagraph"/>
-              <w:spacing w:before="82"/>
-              <w:ind w:left="429"/>
-              <w:jc w:val="left"/>
-              <w:rPr>
-                <w:sz w:val="24"/>
-              </w:rPr>
-            </w:pPr>
-            <w:r>
-              <w:rPr>
-                <w:sz w:val="24"/>
-              </w:rPr>
-              <w:t>Large</w:t>
-            </w:r>
-          </w:p>
-        </w:tc>
-        <w:tc>
-          <w:tcPr>
-            <w:tcW w:type="dxa" w:w="2800"/>
-          </w:tcPr>
-          <w:p>
-            <w:pPr>
-              <w:pStyle w:val="TableParagraph"/>
-              <w:spacing w:before="82"/>
-              <w:ind w:left="14"/>
-              <w:rPr>
-                <w:sz w:val="24"/>
-              </w:rPr>
-            </w:pPr>
-            <w:r>
-              <w:rPr>
-                <w:sz w:val="24"/>
-              </w:rPr>
-              <w:t>4</w:t>
-            </w:r>
-          </w:p>
-        </w:tc>
-        <w:tc>
-          <w:tcPr>
-            <w:tcW w:type="dxa" w:w="2560"/>
-          </w:tcPr>
-          <w:p>
-            <w:pPr>
-              <w:pStyle w:val="TableParagraph"/>
-              <w:spacing w:before="82"/>
-              <w:ind w:left="24"/>
-              <w:rPr>
-                <w:sz w:val="24"/>
-              </w:rPr>
-            </w:pPr>
-            <w:r>
-              <w:rPr>
-                <w:sz w:val="24"/>
-              </w:rPr>
-              <w:t>8</w:t>
-            </w:r>
-          </w:p>
-        </w:tc>
-        <w:tc>
-          <w:tcPr>
-            <w:tcW w:type="dxa" w:w="2400"/>
-          </w:tcPr>
-          <w:p>
-            <w:pPr>
-              <w:pStyle w:val="TableParagraph"/>
-              <w:spacing w:before="82"/>
-              <w:ind w:left="14"/>
-              <w:rPr>
-                <w:sz w:val="24"/>
-              </w:rPr>
-            </w:pPr>
-            <w:r>
-              <w:rPr>
-                <w:sz w:val="24"/>
-              </w:rPr>
-              <w:t>10</w:t>
-            </w:r>
-          </w:p>
-        </w:tc>
-      </w:tr>
-      <w:tr>
-        <w:trPr>
-          <w:trHeight w:hRule="atLeast" w:val="559"/>
-        </w:trPr>
-        <w:tc>
-          <w:tcPr>
-            <w:tcW w:type="dxa" w:w="6900"/>
-            <w:gridSpan w:val="3"/>
-          </w:tcPr>
-          <w:p>
-            <w:pPr>
-              <w:pStyle w:val="TableParagraph"/>
-              <w:spacing w:before="102"/>
-              <w:ind w:left="14"/>
-              <w:rPr>
-                <w:sz w:val="24"/>
-              </w:rPr>
-            </w:pPr>
-            <w:r>
-              <w:rPr>
-                <w:sz w:val="24"/>
-              </w:rPr>
-              <w:t>Total</w:t>
-            </w:r>
-          </w:p>
-        </w:tc>
-        <w:tc>
-          <w:tcPr>
-            <w:tcW w:type="dxa" w:w="2400"/>
-          </w:tcPr>
-          <w:p>
-            <w:pPr>
-              <w:pStyle w:val="TableParagraph"/>
-              <w:spacing w:before="102"/>
-              <w:ind w:left="14"/>
-              <w:rPr>
-                <w:sz w:val="24"/>
-              </w:rPr>
-            </w:pPr>
-            <w:r>
-              <w:rPr>
-                <w:sz w:val="24"/>
-              </w:rPr>
-              <w:t>30</w:t>
+                <w:b/>
+                <w:rFonts w:ascii="Segoe UI" w:hAnsi="Segoe UI"/>
+                <w:sz w:val="17"/>
+                <w:color w:val="1E293B"/>
+              </w:rPr>
+              <w:t>100% Host Aktif (8 Host x 3 DC)</w:t>
             </w:r>
           </w:p>
         </w:tc>

</xml_diff>